<commit_message>
more improvements in testing
</commit_message>
<xml_diff>
--- a/HFF_CNN_Transformer_OCR_SICAAI2026.docx
+++ b/HFF_CNN_Transformer_OCR_SICAAI2026.docx
@@ -303,35 +303,26 @@
           <w:caps/>
         </w:rPr>
       </w:pPr>
-      <w:proofErr w:type="gramStart"/>
       <w:r>
         <w:rPr>
           <w:b/>
           <w:caps/>
         </w:rPr>
-        <w:t>Hierarchical</w:t>
-      </w:r>
-      <w:proofErr w:type="gramEnd"/>
+        <w:t xml:space="preserve">Hierarchical Feature Fusion for </w:t>
+      </w:r>
       <w:r>
         <w:rPr>
           <w:b/>
           <w:caps/>
         </w:rPr>
-        <w:t xml:space="preserve"> Feature Fusion for </w:t>
+        <w:t>IMPROVED</w:t>
       </w:r>
       <w:r>
         <w:rPr>
           <w:b/>
           <w:caps/>
         </w:rPr>
-        <w:t>IMPROVED</w:t>
-      </w:r>
-      <w:r>
-        <w:rPr>
-          <w:b/>
-          <w:caps/>
-        </w:rPr>
-        <w:t xml:space="preserve"> Optical Character Recognition Using CNN-Transformer Architecture with CTC Decoding</w:t>
+        <w:t xml:space="preserve"> Optical Character Recognition Using CNN-Transformer Architecture</w:t>
       </w:r>
     </w:p>
     <w:p>
@@ -460,7 +451,6 @@
         </w:rPr>
         <w:t xml:space="preserve">University of </w:t>
       </w:r>
-      <w:proofErr w:type="spellStart"/>
       <w:r>
         <w:rPr>
           <w:sz w:val="22"/>
@@ -468,7 +458,6 @@
         </w:rPr>
         <w:t>Niš</w:t>
       </w:r>
-      <w:proofErr w:type="spellEnd"/>
       <w:r>
         <w:rPr>
           <w:sz w:val="22"/>
@@ -476,7 +465,6 @@
         </w:rPr>
         <w:t xml:space="preserve">, </w:t>
       </w:r>
-      <w:proofErr w:type="spellStart"/>
       <w:r>
         <w:rPr>
           <w:sz w:val="22"/>
@@ -496,15 +484,7 @@
           <w:sz w:val="22"/>
           <w:szCs w:val="22"/>
         </w:rPr>
-        <w:t>egradska</w:t>
-      </w:r>
-      <w:proofErr w:type="spellEnd"/>
-      <w:r>
-        <w:rPr>
-          <w:sz w:val="22"/>
-          <w:szCs w:val="22"/>
-        </w:rPr>
-        <w:t xml:space="preserve"> 33</w:t>
+        <w:t>egradska 33</w:t>
       </w:r>
       <w:r>
         <w:rPr>
@@ -527,7 +507,6 @@
         </w:rPr>
         <w:t xml:space="preserve"> </w:t>
       </w:r>
-      <w:proofErr w:type="spellStart"/>
       <w:r>
         <w:rPr>
           <w:sz w:val="22"/>
@@ -542,7 +521,6 @@
         </w:rPr>
         <w:t>š</w:t>
       </w:r>
-      <w:proofErr w:type="spellEnd"/>
       <w:r>
         <w:rPr>
           <w:sz w:val="22"/>
@@ -568,28 +546,18 @@
         </w:rPr>
         <w:t xml:space="preserve">e-mail: </w:t>
       </w:r>
-      <w:r>
-        <w:fldChar w:fldCharType="begin"/>
-      </w:r>
-      <w:r>
-        <w:instrText>HYPERLINK "mailto:veljko.petko0022@gmail.com"</w:instrText>
-      </w:r>
-      <w:r>
-        <w:fldChar w:fldCharType="separate"/>
-      </w:r>
-      <w:r>
-        <w:rPr>
-          <w:rStyle w:val="Hyperlink"/>
-        </w:rPr>
-        <w:t>veljko.petko0022@gmail.com</w:t>
-      </w:r>
-      <w:r>
-        <w:fldChar w:fldCharType="end"/>
-      </w:r>
+      <w:hyperlink r:id="rId8" w:history="1">
+        <w:r>
+          <w:rPr>
+            <w:rStyle w:val="Hyperlink"/>
+          </w:rPr>
+          <w:t>veljko.petko0022@gmail.com</w:t>
+        </w:r>
+      </w:hyperlink>
       <w:r>
         <w:t xml:space="preserve">, </w:t>
       </w:r>
-      <w:hyperlink r:id="rId8" w:history="1">
+      <w:hyperlink r:id="rId9" w:history="1">
         <w:r>
           <w:rPr>
             <w:rStyle w:val="Hyperlink"/>
@@ -847,39 +815,7 @@
           <w:szCs w:val="22"/>
         </w:rPr>
         <w:lastRenderedPageBreak/>
-        <w:t xml:space="preserve">standard approach for extracting visual features from text images. More recently, Transformer-based </w:t>
-      </w:r>
-      <w:proofErr w:type="gramStart"/>
-      <w:r>
-        <w:rPr>
-          <w:sz w:val="22"/>
-          <w:szCs w:val="22"/>
-        </w:rPr>
-        <w:t>architectures</w:t>
-      </w:r>
-      <w:proofErr w:type="gramEnd"/>
-      <w:r>
-        <w:rPr>
-          <w:sz w:val="22"/>
-          <w:szCs w:val="22"/>
-        </w:rPr>
-        <w:t xml:space="preserve">, originally proposed for natural language processing, </w:t>
-      </w:r>
-      <w:proofErr w:type="gramStart"/>
-      <w:r>
-        <w:rPr>
-          <w:sz w:val="22"/>
-          <w:szCs w:val="22"/>
-        </w:rPr>
-        <w:t>have</w:t>
-      </w:r>
-      <w:proofErr w:type="gramEnd"/>
-      <w:r>
-        <w:rPr>
-          <w:sz w:val="22"/>
-          <w:szCs w:val="22"/>
-        </w:rPr>
-        <w:t xml:space="preserve"> been successfully adapted for sequence recognition tasks, demonstrating strong performance in capturing long-range dependencies within feature sequences.</w:t>
+        <w:t>standard approach for extracting visual features from text images. More recently, Transformer-based architectures, originally proposed for natural language processing, have been successfully adapted for sequence recognition tasks, demonstrating strong performance in capturing long-range dependencies within feature sequences.</w:t>
       </w:r>
     </w:p>
     <w:p>
@@ -1085,23 +1021,7 @@
           <w:sz w:val="22"/>
           <w:szCs w:val="22"/>
         </w:rPr>
-        <w:t xml:space="preserve">We </w:t>
-      </w:r>
-      <w:proofErr w:type="gramStart"/>
-      <w:r>
-        <w:rPr>
-          <w:sz w:val="22"/>
-          <w:szCs w:val="22"/>
-        </w:rPr>
-        <w:t>conduct</w:t>
-      </w:r>
-      <w:proofErr w:type="gramEnd"/>
-      <w:r>
-        <w:rPr>
-          <w:sz w:val="22"/>
-          <w:szCs w:val="22"/>
-        </w:rPr>
-        <w:t xml:space="preserve"> a controlled experimental comparison between the baseline CNN-Transformer and the proposed model, demonstrating consistent improvement across all evaluation metrics, with the HFF model achieving a test CER of 2.44% compared to 2.62% for the baseline, </w:t>
+        <w:t xml:space="preserve">We conduct a controlled experimental comparison between the baseline CNN-Transformer and the proposed model, demonstrating consistent improvement across all evaluation metrics, with the HFF model achieving a test CER of 2.44% compared to 2.62% for the baseline, </w:t>
       </w:r>
       <w:r>
         <w:rPr>
@@ -1167,23 +1087,7 @@
           <w:sz w:val="22"/>
           <w:szCs w:val="22"/>
         </w:rPr>
-        <w:t xml:space="preserve">This section describes the overall methodology of the proposed approach, including the data generation process, dataset </w:t>
-      </w:r>
-      <w:proofErr w:type="gramStart"/>
-      <w:r>
-        <w:rPr>
-          <w:sz w:val="22"/>
-          <w:szCs w:val="22"/>
-        </w:rPr>
-        <w:t>preparation,  the</w:t>
-      </w:r>
-      <w:proofErr w:type="gramEnd"/>
-      <w:r>
-        <w:rPr>
-          <w:sz w:val="22"/>
-          <w:szCs w:val="22"/>
-        </w:rPr>
-        <w:t xml:space="preserve"> architecture design</w:t>
+        <w:t>This section describes the overall methodology of the proposed approach, including the data generation process, dataset preparation,  the architecture design</w:t>
       </w:r>
       <w:r>
         <w:rPr>
@@ -1259,23 +1163,7 @@
           <w:sz w:val="22"/>
           <w:szCs w:val="22"/>
         </w:rPr>
-        <w:t xml:space="preserve">The training dataset consists of 100,000 synthetically generated grayscale images, each with a resolution of </w:t>
-      </w:r>
-      <w:proofErr w:type="gramStart"/>
-      <w:r>
-        <w:rPr>
-          <w:sz w:val="22"/>
-          <w:szCs w:val="22"/>
-        </w:rPr>
-        <w:t>288×64</w:t>
-      </w:r>
-      <w:proofErr w:type="gramEnd"/>
-      <w:r>
-        <w:rPr>
-          <w:sz w:val="22"/>
-          <w:szCs w:val="22"/>
-        </w:rPr>
-        <w:t xml:space="preserve"> pixels. Text content is generated using two strategies: </w:t>
+        <w:t xml:space="preserve">The training dataset consists of 100,000 synthetically generated grayscale images, each with a resolution of 288×64 pixels. Text content is generated using two strategies: </w:t>
       </w:r>
     </w:p>
     <w:p>
@@ -1361,23 +1249,7 @@
           <w:sz w:val="22"/>
           <w:szCs w:val="22"/>
         </w:rPr>
-        <w:t xml:space="preserve">Each image is rendered using one of 14 fonts, selected at random, including typefaces from the </w:t>
-      </w:r>
-      <w:proofErr w:type="spellStart"/>
-      <w:r>
-        <w:rPr>
-          <w:sz w:val="22"/>
-          <w:szCs w:val="22"/>
-        </w:rPr>
-        <w:t>DejaVu</w:t>
-      </w:r>
-      <w:proofErr w:type="spellEnd"/>
-      <w:r>
-        <w:rPr>
-          <w:sz w:val="22"/>
-          <w:szCs w:val="22"/>
-        </w:rPr>
-        <w:t xml:space="preserve">, Roboto, Arial, Montserrat, and Playfair Display families, among others. Text is drawn in black on a near-white grayscale background, with slight random vertical jitter and </w:t>
+        <w:t xml:space="preserve">Each image is rendered using one of 14 fonts, selected at random, including typefaces from the DejaVu, Roboto, Arial, Montserrat, and Playfair Display families, among others. Text is drawn in black on a near-white grayscale background, with slight random vertical jitter and </w:t>
       </w:r>
       <w:r>
         <w:rPr>
@@ -1490,6 +1362,119 @@
     </w:p>
     <w:p>
       <w:pPr>
+        <w:jc w:val="both"/>
+        <w:rPr>
+          <w:sz w:val="22"/>
+          <w:szCs w:val="22"/>
+        </w:rPr>
+      </w:pPr>
+    </w:p>
+    <w:p>
+      <w:pPr>
+        <w:jc w:val="both"/>
+        <w:rPr>
+          <w:sz w:val="22"/>
+          <w:szCs w:val="22"/>
+        </w:rPr>
+      </w:pPr>
+      <w:r>
+        <w:rPr>
+          <w:noProof/>
+          <w:sz w:val="22"/>
+          <w:szCs w:val="22"/>
+        </w:rPr>
+        <w:drawing>
+          <wp:inline distT="0" distB="0" distL="0" distR="0" wp14:anchorId="0EDC45EC" wp14:editId="25923758">
+            <wp:extent cx="5279390" cy="460375"/>
+            <wp:effectExtent l="0" t="0" r="0" b="0"/>
+            <wp:docPr id="1264856365" name="Picture 1"/>
+            <wp:cNvGraphicFramePr>
+              <a:graphicFrameLocks xmlns:a="http://schemas.openxmlformats.org/drawingml/2006/main" noChangeAspect="1"/>
+            </wp:cNvGraphicFramePr>
+            <a:graphic xmlns:a="http://schemas.openxmlformats.org/drawingml/2006/main">
+              <a:graphicData uri="http://schemas.openxmlformats.org/drawingml/2006/picture">
+                <pic:pic xmlns:pic="http://schemas.openxmlformats.org/drawingml/2006/picture">
+                  <pic:nvPicPr>
+                    <pic:cNvPr id="0" name="Picture 2"/>
+                    <pic:cNvPicPr>
+                      <a:picLocks noChangeAspect="1" noChangeArrowheads="1"/>
+                    </pic:cNvPicPr>
+                  </pic:nvPicPr>
+                  <pic:blipFill>
+                    <a:blip r:embed="rId10">
+                      <a:extLst>
+                        <a:ext uri="{28A0092B-C50C-407E-A947-70E740481C1C}">
+                          <a14:useLocalDpi xmlns:a14="http://schemas.microsoft.com/office/drawing/2010/main" val="0"/>
+                        </a:ext>
+                      </a:extLst>
+                    </a:blip>
+                    <a:srcRect/>
+                    <a:stretch>
+                      <a:fillRect/>
+                    </a:stretch>
+                  </pic:blipFill>
+                  <pic:spPr bwMode="auto">
+                    <a:xfrm>
+                      <a:off x="0" y="0"/>
+                      <a:ext cx="5279390" cy="460375"/>
+                    </a:xfrm>
+                    <a:prstGeom prst="rect">
+                      <a:avLst/>
+                    </a:prstGeom>
+                    <a:noFill/>
+                    <a:ln>
+                      <a:noFill/>
+                    </a:ln>
+                  </pic:spPr>
+                </pic:pic>
+              </a:graphicData>
+            </a:graphic>
+          </wp:inline>
+        </w:drawing>
+      </w:r>
+    </w:p>
+    <w:p>
+      <w:pPr>
+        <w:ind w:firstLine="360"/>
+        <w:jc w:val="center"/>
+        <w:rPr>
+          <w:sz w:val="22"/>
+          <w:szCs w:val="22"/>
+        </w:rPr>
+      </w:pPr>
+      <w:r>
+        <w:rPr>
+          <w:b/>
+          <w:sz w:val="20"/>
+          <w:szCs w:val="20"/>
+        </w:rPr>
+        <w:t>Figure</w:t>
+      </w:r>
+      <w:r>
+        <w:rPr>
+          <w:b/>
+          <w:sz w:val="20"/>
+          <w:szCs w:val="20"/>
+        </w:rPr>
+        <w:t xml:space="preserve"> 1</w:t>
+      </w:r>
+      <w:r>
+        <w:rPr>
+          <w:sz w:val="20"/>
+          <w:szCs w:val="20"/>
+        </w:rPr>
+        <w:t xml:space="preserve">. </w:t>
+      </w:r>
+      <w:r>
+        <w:rPr>
+          <w:sz w:val="20"/>
+          <w:szCs w:val="20"/>
+        </w:rPr>
+        <w:t>Examples of synthetically generated training images</w:t>
+      </w:r>
+    </w:p>
+    <w:p>
+      <w:pPr>
         <w:ind w:firstLine="720"/>
         <w:jc w:val="both"/>
         <w:rPr>
@@ -1529,6 +1514,123 @@
     </w:p>
     <w:p>
       <w:pPr>
+        <w:jc w:val="both"/>
+        <w:rPr>
+          <w:i/>
+          <w:sz w:val="22"/>
+          <w:szCs w:val="22"/>
+        </w:rPr>
+      </w:pPr>
+      <w:r>
+        <w:rPr>
+          <w:i/>
+          <w:noProof/>
+          <w:sz w:val="22"/>
+          <w:szCs w:val="22"/>
+        </w:rPr>
+        <w:drawing>
+          <wp:inline distT="0" distB="0" distL="0" distR="0" wp14:anchorId="7D415B88" wp14:editId="4002F300">
+            <wp:extent cx="5278120" cy="2482850"/>
+            <wp:effectExtent l="0" t="0" r="0" b="0"/>
+            <wp:docPr id="2140714627" name="Picture 4"/>
+            <wp:cNvGraphicFramePr>
+              <a:graphicFrameLocks xmlns:a="http://schemas.openxmlformats.org/drawingml/2006/main" noChangeAspect="1"/>
+            </wp:cNvGraphicFramePr>
+            <a:graphic xmlns:a="http://schemas.openxmlformats.org/drawingml/2006/main">
+              <a:graphicData uri="http://schemas.openxmlformats.org/drawingml/2006/picture">
+                <pic:pic xmlns:pic="http://schemas.openxmlformats.org/drawingml/2006/picture">
+                  <pic:nvPicPr>
+                    <pic:cNvPr id="2140714627" name="Picture 2140714627"/>
+                    <pic:cNvPicPr/>
+                  </pic:nvPicPr>
+                  <pic:blipFill>
+                    <a:blip r:embed="rId11">
+                      <a:extLst>
+                        <a:ext uri="{28A0092B-C50C-407E-A947-70E740481C1C}">
+                          <a14:useLocalDpi xmlns:a14="http://schemas.microsoft.com/office/drawing/2010/main" val="0"/>
+                        </a:ext>
+                      </a:extLst>
+                    </a:blip>
+                    <a:stretch>
+                      <a:fillRect/>
+                    </a:stretch>
+                  </pic:blipFill>
+                  <pic:spPr>
+                    <a:xfrm>
+                      <a:off x="0" y="0"/>
+                      <a:ext cx="5278120" cy="2482850"/>
+                    </a:xfrm>
+                    <a:prstGeom prst="rect">
+                      <a:avLst/>
+                    </a:prstGeom>
+                  </pic:spPr>
+                </pic:pic>
+              </a:graphicData>
+            </a:graphic>
+          </wp:inline>
+        </w:drawing>
+      </w:r>
+    </w:p>
+    <w:p>
+      <w:pPr>
+        <w:ind w:firstLine="360"/>
+        <w:jc w:val="center"/>
+        <w:rPr>
+          <w:sz w:val="22"/>
+          <w:szCs w:val="22"/>
+        </w:rPr>
+      </w:pPr>
+      <w:r>
+        <w:rPr>
+          <w:b/>
+          <w:sz w:val="20"/>
+          <w:szCs w:val="20"/>
+        </w:rPr>
+        <w:t>Figure</w:t>
+      </w:r>
+      <w:r>
+        <w:rPr>
+          <w:b/>
+          <w:sz w:val="20"/>
+          <w:szCs w:val="20"/>
+        </w:rPr>
+        <w:t xml:space="preserve"> </w:t>
+      </w:r>
+      <w:r>
+        <w:rPr>
+          <w:b/>
+          <w:sz w:val="20"/>
+          <w:szCs w:val="20"/>
+        </w:rPr>
+        <w:t>2</w:t>
+      </w:r>
+      <w:r>
+        <w:rPr>
+          <w:sz w:val="20"/>
+          <w:szCs w:val="20"/>
+        </w:rPr>
+        <w:t xml:space="preserve">. </w:t>
+      </w:r>
+      <w:r>
+        <w:rPr>
+          <w:sz w:val="20"/>
+          <w:szCs w:val="20"/>
+        </w:rPr>
+        <w:t>Baseline CNN-Transformer Architecture with tensor shapes at each stage</w:t>
+      </w:r>
+    </w:p>
+    <w:p>
+      <w:pPr>
+        <w:jc w:val="both"/>
+        <w:rPr>
+          <w:i/>
+          <w:sz w:val="22"/>
+          <w:szCs w:val="22"/>
+        </w:rPr>
+      </w:pPr>
+    </w:p>
+    <w:p>
+      <w:pPr>
         <w:ind w:firstLine="720"/>
         <w:jc w:val="both"/>
         <w:rPr>
@@ -1572,23 +1674,7 @@
           <w:sz w:val="22"/>
           <w:szCs w:val="22"/>
         </w:rPr>
-        <w:t xml:space="preserve"> processes grayscale input images of shape 1×64×288 through four convolutional blocks. The first block applies a 3×3 convolution producing 64 feature maps, followed by batch normalization, </w:t>
-      </w:r>
-      <w:proofErr w:type="spellStart"/>
-      <w:r>
-        <w:rPr>
-          <w:sz w:val="22"/>
-          <w:szCs w:val="22"/>
-        </w:rPr>
-        <w:t>ReLU</w:t>
-      </w:r>
-      <w:proofErr w:type="spellEnd"/>
-      <w:r>
-        <w:rPr>
-          <w:sz w:val="22"/>
-          <w:szCs w:val="22"/>
-        </w:rPr>
-        <w:t xml:space="preserve"> activation, and 2×2 max pooling, halving both spatial dimensions. The second block increases the channel depth to 128 and applies max pooling only along the height axis, preserving the temporal width dimension. The third block consists of two consecutive 3×3 convolutions with 256 channels, again followed by height-only pooling. The fourth block mirrors this structure with 512 channels. A final convolutional layer with a kernel of size 4×1 collapses the remaining height dimension to one, </w:t>
+        <w:t xml:space="preserve"> processes grayscale input images of shape 1×64×288 through four convolutional blocks. The first block applies a 3×3 convolution producing 64 feature maps, followed by batch normalization, ReLU activation, and 2×2 max pooling, halving both spatial dimensions. The second block increases the channel depth to 128 and applies max pooling only along the height axis, preserving the temporal width dimension. The third block consists of two consecutive 3×3 convolutions with 256 channels, again followed by height-only pooling. The fourth block mirrors this structure with 512 channels. A final convolutional layer with a kernel of size 4×1 collapses the remaining height dimension to one, </w:t>
       </w:r>
       <w:r>
         <w:rPr>
@@ -1616,7 +1702,15 @@
           <w:sz w:val="22"/>
           <w:szCs w:val="22"/>
         </w:rPr>
-        <w:t>ropout with a probability of 0.05 is applied after blocks two and three, and 0.1 after the final layer. The resulting feature map is squeezed and transposed to obtain a sequence of 144 feature vectors of dimension 512, which serves as input to the Transformer encoder.</w:t>
+        <w:t xml:space="preserve">ropout with a probability of 0.05 is applied after blocks two and three, and 0.1 after the final layer. The resulting feature map is squeezed and </w:t>
+      </w:r>
+      <w:r>
+        <w:rPr>
+          <w:sz w:val="22"/>
+          <w:szCs w:val="22"/>
+        </w:rPr>
+        <w:lastRenderedPageBreak/>
+        <w:t>transposed to obtain a sequence of 144 feature vectors of dimension 512, which serves as input to the Transformer encoder.</w:t>
       </w:r>
     </w:p>
     <w:p>
@@ -1705,6 +1799,130 @@
     </w:p>
     <w:p>
       <w:pPr>
+        <w:jc w:val="both"/>
+        <w:rPr>
+          <w:i/>
+          <w:sz w:val="22"/>
+          <w:szCs w:val="22"/>
+        </w:rPr>
+      </w:pPr>
+      <w:r>
+        <w:rPr>
+          <w:i/>
+          <w:noProof/>
+          <w:sz w:val="22"/>
+          <w:szCs w:val="22"/>
+        </w:rPr>
+        <w:drawing>
+          <wp:inline distT="0" distB="0" distL="0" distR="0" wp14:anchorId="3A35BBE4" wp14:editId="29565EB1">
+            <wp:extent cx="5382168" cy="1960014"/>
+            <wp:effectExtent l="0" t="0" r="0" b="2540"/>
+            <wp:docPr id="710397888" name="Picture 5"/>
+            <wp:cNvGraphicFramePr>
+              <a:graphicFrameLocks xmlns:a="http://schemas.openxmlformats.org/drawingml/2006/main" noChangeAspect="1"/>
+            </wp:cNvGraphicFramePr>
+            <a:graphic xmlns:a="http://schemas.openxmlformats.org/drawingml/2006/main">
+              <a:graphicData uri="http://schemas.openxmlformats.org/drawingml/2006/picture">
+                <pic:pic xmlns:pic="http://schemas.openxmlformats.org/drawingml/2006/picture">
+                  <pic:nvPicPr>
+                    <pic:cNvPr id="710397888" name="Picture 710397888"/>
+                    <pic:cNvPicPr/>
+                  </pic:nvPicPr>
+                  <pic:blipFill>
+                    <a:blip r:embed="rId12">
+                      <a:extLst>
+                        <a:ext uri="{28A0092B-C50C-407E-A947-70E740481C1C}">
+                          <a14:useLocalDpi xmlns:a14="http://schemas.microsoft.com/office/drawing/2010/main" val="0"/>
+                        </a:ext>
+                      </a:extLst>
+                    </a:blip>
+                    <a:stretch>
+                      <a:fillRect/>
+                    </a:stretch>
+                  </pic:blipFill>
+                  <pic:spPr>
+                    <a:xfrm>
+                      <a:off x="0" y="0"/>
+                      <a:ext cx="5432869" cy="1978478"/>
+                    </a:xfrm>
+                    <a:prstGeom prst="rect">
+                      <a:avLst/>
+                    </a:prstGeom>
+                  </pic:spPr>
+                </pic:pic>
+              </a:graphicData>
+            </a:graphic>
+          </wp:inline>
+        </w:drawing>
+      </w:r>
+    </w:p>
+    <w:p>
+      <w:pPr>
+        <w:ind w:firstLine="360"/>
+        <w:jc w:val="center"/>
+        <w:rPr>
+          <w:sz w:val="22"/>
+          <w:szCs w:val="22"/>
+        </w:rPr>
+      </w:pPr>
+      <w:r>
+        <w:rPr>
+          <w:b/>
+          <w:sz w:val="20"/>
+          <w:szCs w:val="20"/>
+        </w:rPr>
+        <w:t>Figure</w:t>
+      </w:r>
+      <w:r>
+        <w:rPr>
+          <w:b/>
+          <w:sz w:val="20"/>
+          <w:szCs w:val="20"/>
+        </w:rPr>
+        <w:t xml:space="preserve"> </w:t>
+      </w:r>
+      <w:r>
+        <w:rPr>
+          <w:b/>
+          <w:sz w:val="20"/>
+          <w:szCs w:val="20"/>
+        </w:rPr>
+        <w:t>3</w:t>
+      </w:r>
+      <w:r>
+        <w:rPr>
+          <w:sz w:val="20"/>
+          <w:szCs w:val="20"/>
+        </w:rPr>
+        <w:t xml:space="preserve">. </w:t>
+      </w:r>
+      <w:r>
+        <w:rPr>
+          <w:sz w:val="20"/>
+          <w:szCs w:val="20"/>
+        </w:rPr>
+        <w:t>HFF</w:t>
+      </w:r>
+      <w:r>
+        <w:rPr>
+          <w:sz w:val="20"/>
+          <w:szCs w:val="20"/>
+        </w:rPr>
+        <w:t xml:space="preserve"> CNN-Transformer Architecture with tensor shapes at each stage</w:t>
+      </w:r>
+    </w:p>
+    <w:p>
+      <w:pPr>
+        <w:jc w:val="both"/>
+        <w:rPr>
+          <w:i/>
+          <w:sz w:val="22"/>
+          <w:szCs w:val="22"/>
+        </w:rPr>
+      </w:pPr>
+    </w:p>
+    <w:p>
+      <w:pPr>
         <w:ind w:firstLine="720"/>
         <w:jc w:val="both"/>
         <w:rPr>
@@ -1783,55 +2001,83 @@
           <w:sz w:val="22"/>
           <w:szCs w:val="22"/>
         </w:rPr>
-        <w:t xml:space="preserve"> is divided into three named stages. The shallow stage replicates </w:t>
-      </w:r>
-      <w:proofErr w:type="gramStart"/>
-      <w:r>
-        <w:rPr>
-          <w:sz w:val="22"/>
-          <w:szCs w:val="22"/>
-        </w:rPr>
-        <w:t>blocks</w:t>
-      </w:r>
-      <w:proofErr w:type="gramEnd"/>
-      <w:r>
-        <w:rPr>
-          <w:sz w:val="22"/>
-          <w:szCs w:val="22"/>
-        </w:rPr>
-        <w:t xml:space="preserve"> one and two of the </w:t>
-      </w:r>
-      <w:proofErr w:type="gramStart"/>
-      <w:r>
-        <w:rPr>
-          <w:sz w:val="22"/>
-          <w:szCs w:val="22"/>
-        </w:rPr>
-        <w:t>baseline</w:t>
-      </w:r>
-      <w:proofErr w:type="gramEnd"/>
-      <w:r>
-        <w:rPr>
-          <w:sz w:val="22"/>
-          <w:szCs w:val="22"/>
-        </w:rPr>
-        <w:t xml:space="preserve">, processing the input from 1×64×288 through two convolutional layers to produce a feature map of shape 128×16×144. The deep stage replicates </w:t>
-      </w:r>
-      <w:proofErr w:type="gramStart"/>
-      <w:r>
-        <w:rPr>
-          <w:sz w:val="22"/>
-          <w:szCs w:val="22"/>
-        </w:rPr>
-        <w:t>blocks</w:t>
-      </w:r>
-      <w:proofErr w:type="gramEnd"/>
-      <w:r>
-        <w:rPr>
-          <w:sz w:val="22"/>
-          <w:szCs w:val="22"/>
-        </w:rPr>
-        <w:t xml:space="preserve"> three and four, taking the shallow output and producing a feature map of shape 512×4×144. The collapse stage applies a 4×1 convolution to reduce the remaining </w:t>
+        <w:t xml:space="preserve"> is divided into three named stages. The shallow stage replicates blocks one and two of the baseline, processing the input from 1×64×288 through two convolutional layers to produce a feature map of shape 128×16×144. The deep stage replicates blocks three and four, taking the shallow output and producing a feature map of shape 512×4×144. The collapse stage applies a 4×1 convolution to reduce the remaining height dimension to one, </w:t>
+      </w:r>
+      <w:r>
+        <w:rPr>
+          <w:sz w:val="22"/>
+          <w:szCs w:val="22"/>
+        </w:rPr>
+        <w:t xml:space="preserve">producing </w:t>
+      </w:r>
+      <w:r>
+        <w:rPr>
+          <w:sz w:val="22"/>
+          <w:szCs w:val="22"/>
+        </w:rPr>
+        <w:t>the final CNN feature map of shape 512×1×144, identical in shape to the baseline output.</w:t>
+      </w:r>
+    </w:p>
+    <w:p>
+      <w:pPr>
+        <w:ind w:firstLine="720"/>
+        <w:jc w:val="both"/>
+        <w:rPr>
+          <w:sz w:val="22"/>
+          <w:szCs w:val="22"/>
+        </w:rPr>
+      </w:pPr>
+      <w:r>
+        <w:rPr>
+          <w:sz w:val="22"/>
+          <w:szCs w:val="22"/>
+        </w:rPr>
+        <w:t xml:space="preserve">Each of the three feature maps is projected to a common dimensionality of 512 before fusion. The shallow feature map (128×16×144) is first spatially compressed along the height axis using adaptive average pooling, then projected to 512 channels via a 1×1 convolution. The deep feature map (512×4×144) </w:t>
+      </w:r>
+      <w:r>
+        <w:rPr>
+          <w:sz w:val="22"/>
+          <w:szCs w:val="22"/>
+        </w:rPr>
+        <w:t xml:space="preserve">goes through </w:t>
+      </w:r>
+      <w:r>
+        <w:rPr>
+          <w:sz w:val="22"/>
+          <w:szCs w:val="22"/>
+        </w:rPr>
+        <w:t>the same height pooling followed by a 1×1 identity projection. The collapsed feature map requires no additional processing. The three resulting tensors, each of shape 512×1×144, are concatenated along the channel dimension to form a 1536-channel representation, which is then projected back to 512 channels through a final 1×1 convolutional fusion layer followed by batch normalization and ReLU activation. This produces a single fused sequence of 144 vectors of dimension 512, which is passed to the Transformer encoder.</w:t>
+      </w:r>
+    </w:p>
+    <w:p>
+      <w:pPr>
+        <w:ind w:firstLine="720"/>
+        <w:jc w:val="both"/>
+        <w:rPr>
+          <w:sz w:val="22"/>
+          <w:szCs w:val="22"/>
+        </w:rPr>
+      </w:pPr>
+      <w:r>
+        <w:rPr>
+          <w:sz w:val="22"/>
+          <w:szCs w:val="22"/>
+        </w:rPr>
+        <w:t xml:space="preserve">An additional component introduced in the HFF model is an adaptive sequence masking mechanism applied at the Transformer encoder input. For each sample in the batch, the energy of each time step is estimated as the mean absolute activation across the feature dimension. Time steps whose energy falls below 5% of the maximum energy for that sample are masked out and excluded from self-attention computation. A minimum of the first 10 positions is always retained to prevent </w:t>
+      </w:r>
+      <w:r>
+        <w:rPr>
+          <w:sz w:val="22"/>
+          <w:szCs w:val="22"/>
+        </w:rPr>
+        <w:t xml:space="preserve">corrupt </w:t>
+      </w:r>
+      <w:r>
+        <w:rPr>
+          <w:sz w:val="22"/>
+          <w:szCs w:val="22"/>
+        </w:rPr>
+        <w:t xml:space="preserve">masking. This mechanism allows the model to </w:t>
       </w:r>
       <w:r>
         <w:rPr>
@@ -1839,21 +2085,7 @@
           <w:szCs w:val="22"/>
         </w:rPr>
         <w:lastRenderedPageBreak/>
-        <w:t xml:space="preserve">height dimension to one, </w:t>
-      </w:r>
-      <w:r>
-        <w:rPr>
-          <w:sz w:val="22"/>
-          <w:szCs w:val="22"/>
-        </w:rPr>
-        <w:t xml:space="preserve">producing </w:t>
-      </w:r>
-      <w:r>
-        <w:rPr>
-          <w:sz w:val="22"/>
-          <w:szCs w:val="22"/>
-        </w:rPr>
-        <w:t>the final CNN feature map of shape 512×1×144, identical in shape to the baseline output.</w:t>
+        <w:t>focus attention on informative regions of the sequence and ignore padding or low-content columns at the edges of the feature map.</w:t>
       </w:r>
     </w:p>
     <w:p>
@@ -1870,38 +2102,89 @@
           <w:sz w:val="22"/>
           <w:szCs w:val="22"/>
         </w:rPr>
-        <w:t xml:space="preserve">Each of the three feature maps is projected to a common dimensionality of 512 before fusion. The shallow feature map (128×16×144) is first spatially compressed along the height axis using adaptive average pooling, then projected to 512 channels via a 1×1 convolution. The deep feature map (512×4×144) </w:t>
-      </w:r>
-      <w:r>
-        <w:rPr>
-          <w:sz w:val="22"/>
-          <w:szCs w:val="22"/>
-        </w:rPr>
-        <w:t xml:space="preserve">goes through </w:t>
-      </w:r>
-      <w:r>
-        <w:rPr>
-          <w:sz w:val="22"/>
-          <w:szCs w:val="22"/>
-        </w:rPr>
-        <w:t xml:space="preserve">the same height pooling followed by a 1×1 identity projection. The collapsed feature map requires no additional processing. The three resulting tensors, each of shape 512×1×144, are concatenated along the channel dimension to form a 1536-channel representation, which is then projected back to 512 channels through a final 1×1 convolutional fusion layer followed by batch normalization and </w:t>
-      </w:r>
-      <w:proofErr w:type="spellStart"/>
-      <w:r>
-        <w:rPr>
-          <w:sz w:val="22"/>
-          <w:szCs w:val="22"/>
-        </w:rPr>
-        <w:t>ReLU</w:t>
-      </w:r>
-      <w:proofErr w:type="spellEnd"/>
-      <w:r>
-        <w:rPr>
-          <w:sz w:val="22"/>
-          <w:szCs w:val="22"/>
-        </w:rPr>
-        <w:t xml:space="preserve"> activation. This produces a single fused sequence of 144 vectors of dimension 512, which is passed to the Transformer encoder.</w:t>
-      </w:r>
+        <w:t>The Transformer encoder, positional encoding scheme, classification head, and all other components are identical to those of the baseline model, ensuring that any performance difference is attributable solely to the hierarchical fusion and adaptive masking mechanisms.</w:t>
+      </w:r>
+      <w:r>
+        <w:rPr>
+          <w:sz w:val="22"/>
+          <w:szCs w:val="22"/>
+        </w:rPr>
+        <w:t xml:space="preserve"> </w:t>
+      </w:r>
+      <w:r>
+        <w:rPr>
+          <w:sz w:val="22"/>
+          <w:szCs w:val="22"/>
+        </w:rPr>
+        <w:t>The HFF-CNN-Transformer contains approximately 2</w:t>
+      </w:r>
+      <w:r>
+        <w:rPr>
+          <w:sz w:val="22"/>
+          <w:szCs w:val="22"/>
+        </w:rPr>
+        <w:t>5.6</w:t>
+      </w:r>
+      <w:r>
+        <w:rPr>
+          <w:sz w:val="22"/>
+          <w:szCs w:val="22"/>
+        </w:rPr>
+        <w:t xml:space="preserve"> million trainable parameters</w:t>
+      </w:r>
+      <w:r>
+        <w:rPr>
+          <w:sz w:val="22"/>
+          <w:szCs w:val="22"/>
+        </w:rPr>
+        <w:t>.</w:t>
+      </w:r>
+    </w:p>
+    <w:p>
+      <w:pPr>
+        <w:jc w:val="both"/>
+        <w:rPr>
+          <w:i/>
+          <w:sz w:val="22"/>
+          <w:szCs w:val="22"/>
+        </w:rPr>
+      </w:pPr>
+    </w:p>
+    <w:p>
+      <w:pPr>
+        <w:jc w:val="both"/>
+        <w:rPr>
+          <w:i/>
+          <w:sz w:val="22"/>
+          <w:szCs w:val="22"/>
+        </w:rPr>
+      </w:pPr>
+      <w:r>
+        <w:rPr>
+          <w:i/>
+          <w:sz w:val="22"/>
+          <w:szCs w:val="22"/>
+        </w:rPr>
+        <w:t>2.4 Training</w:t>
+      </w:r>
+      <w:r>
+        <w:rPr>
+          <w:i/>
+          <w:sz w:val="22"/>
+          <w:szCs w:val="22"/>
+        </w:rPr>
+        <w:t xml:space="preserve"> Procedure</w:t>
+      </w:r>
+    </w:p>
+    <w:p>
+      <w:pPr>
+        <w:jc w:val="both"/>
+        <w:rPr>
+          <w:i/>
+          <w:sz w:val="22"/>
+          <w:szCs w:val="22"/>
+        </w:rPr>
+      </w:pPr>
     </w:p>
     <w:p>
       <w:pPr>
@@ -1917,21 +2200,14 @@
           <w:sz w:val="22"/>
           <w:szCs w:val="22"/>
         </w:rPr>
-        <w:t xml:space="preserve">An additional component introduced in the HFF model is an adaptive sequence masking mechanism applied at the Transformer encoder input. For each sample in the batch, the energy of each time step is estimated as the mean absolute activation across the feature dimension. Time steps whose energy falls below 5% of the maximum energy for that sample are masked out and excluded from self-attention computation. A minimum of the first 10 positions is always retained to prevent </w:t>
-      </w:r>
-      <w:r>
-        <w:rPr>
-          <w:sz w:val="22"/>
-          <w:szCs w:val="22"/>
-        </w:rPr>
-        <w:t xml:space="preserve">corrupt </w:t>
-      </w:r>
-      <w:r>
-        <w:rPr>
-          <w:sz w:val="22"/>
-          <w:szCs w:val="22"/>
-        </w:rPr>
-        <w:t>masking. This mechanism allows the model to focus attention on informative regions of the sequence and ignore padding or low-content columns at the edges of the feature map.</w:t>
+        <w:t xml:space="preserve">Both </w:t>
+      </w:r>
+      <w:r>
+        <w:rPr>
+          <w:sz w:val="22"/>
+          <w:szCs w:val="22"/>
+        </w:rPr>
+        <w:t>models are trained under identical conditions to ensure a fair and reproducible comparison. The dataset is partitioned into three non-overlapping subsets: 80% for training, 10% for validation, and 10% for testing, using a fixed random split.</w:t>
       </w:r>
     </w:p>
     <w:p>
@@ -1948,12 +2224,474 @@
           <w:sz w:val="22"/>
           <w:szCs w:val="22"/>
         </w:rPr>
-        <w:t>The Transformer encoder, positional encoding scheme, classification head, and all other components are identical to those of the baseline model, ensuring that any performance difference is attributable solely to the hierarchical fusion and adaptive masking mechanisms.</w:t>
-      </w:r>
-      <w:r>
-        <w:rPr>
-          <w:sz w:val="22"/>
-          <w:szCs w:val="22"/>
+        <w:t xml:space="preserve">Both models are optimized using AdamW with a peak learning rate of 7×10⁻⁵ and a weight decay of 10⁻² for L2 regularization. The learning rate schedule consists of a linear warmup phase over the first 3 epochs, during which the learning rate increases to the peak value, followed by cosine decay down to </w:t>
+      </w:r>
+      <w:r>
+        <w:rPr>
+          <w:sz w:val="22"/>
+          <w:szCs w:val="22"/>
+        </w:rPr>
+        <w:t>1</w:t>
+      </w:r>
+      <w:r>
+        <w:rPr>
+          <w:sz w:val="22"/>
+          <w:szCs w:val="22"/>
+        </w:rPr>
+        <w:t xml:space="preserve">% of the peak learning rate over the remaining 12 epochs. Training is conducted for 15 epochs with a batch size of 128 on an NVIDIA L4 GPU. </w:t>
+      </w:r>
+      <w:r>
+        <w:rPr>
+          <w:sz w:val="22"/>
+          <w:szCs w:val="22"/>
+        </w:rPr>
+        <w:t>Automatic Mixed Precision (AMP) with float16 is enabled during the training forward and backward pass to reduce memory usage and accelerate computation, with gradient scaling applied to prevent underflow. Validation and test evaluation are performed in full float32 precision</w:t>
+      </w:r>
+      <w:r>
+        <w:rPr>
+          <w:sz w:val="22"/>
+          <w:szCs w:val="22"/>
+        </w:rPr>
+        <w:t>. Gradient clipping with a maximum norm of 5.0 is applied at each update step to prevent exploding gradients.</w:t>
+      </w:r>
+    </w:p>
+    <w:p>
+      <w:pPr>
+        <w:ind w:firstLine="720"/>
+        <w:jc w:val="both"/>
+        <w:rPr>
+          <w:sz w:val="22"/>
+          <w:szCs w:val="22"/>
+        </w:rPr>
+      </w:pPr>
+      <w:r>
+        <w:rPr>
+          <w:sz w:val="22"/>
+          <w:szCs w:val="22"/>
+        </w:rPr>
+        <w:t>The loss function used for training is Connectionist Temporal Classification (CTC) loss with the blank token assigned to index 0. The zero_infinity flag is enabled to suppress infinite loss values that may arise from numerically unstable alignments, improving training stability.</w:t>
+      </w:r>
+    </w:p>
+    <w:p>
+      <w:pPr>
+        <w:ind w:firstLine="720"/>
+        <w:jc w:val="both"/>
+        <w:rPr>
+          <w:sz w:val="22"/>
+          <w:szCs w:val="22"/>
+        </w:rPr>
+      </w:pPr>
+      <w:r>
+        <w:rPr>
+          <w:sz w:val="22"/>
+          <w:szCs w:val="22"/>
+        </w:rPr>
+        <w:t>At the end of each epoch, the model is evaluated on the validation set. The checkpoint corresponding to the lowest validation CER across all epochs is saved and subsequently loaded for final evaluation on the held-out test set.</w:t>
+      </w:r>
+    </w:p>
+    <w:p>
+      <w:pPr>
+        <w:jc w:val="both"/>
+        <w:rPr>
+          <w:sz w:val="22"/>
+          <w:szCs w:val="22"/>
+        </w:rPr>
+      </w:pPr>
+    </w:p>
+    <w:p>
+      <w:pPr>
+        <w:jc w:val="both"/>
+        <w:rPr>
+          <w:b/>
+          <w:sz w:val="22"/>
+          <w:szCs w:val="22"/>
+        </w:rPr>
+      </w:pPr>
+      <w:r>
+        <w:rPr>
+          <w:b/>
+          <w:sz w:val="22"/>
+          <w:szCs w:val="22"/>
+        </w:rPr>
+        <w:t xml:space="preserve">3. </w:t>
+      </w:r>
+      <w:r>
+        <w:rPr>
+          <w:b/>
+          <w:sz w:val="22"/>
+          <w:szCs w:val="22"/>
+        </w:rPr>
+        <w:t>Results</w:t>
+      </w:r>
+    </w:p>
+    <w:p>
+      <w:pPr>
+        <w:jc w:val="both"/>
+        <w:rPr>
+          <w:b/>
+          <w:sz w:val="22"/>
+          <w:szCs w:val="22"/>
+        </w:rPr>
+      </w:pPr>
+    </w:p>
+    <w:p>
+      <w:pPr>
+        <w:jc w:val="both"/>
+        <w:rPr>
+          <w:sz w:val="22"/>
+          <w:szCs w:val="22"/>
+        </w:rPr>
+      </w:pPr>
+      <w:r>
+        <w:rPr>
+          <w:sz w:val="22"/>
+          <w:szCs w:val="22"/>
+        </w:rPr>
+        <w:t>This section presents the experimental results obtained by training and evaluating both models under the conditions described in Section 2.4. Performance is measured using Character Error Rate (CER), computed as the edit distance between the predicted and ground truth character sequences normalized by the ground truth length, and CTC loss evaluated on the held-out test set. Lower values indicate better performance for both metrics.</w:t>
+      </w:r>
+    </w:p>
+    <w:p>
+      <w:pPr>
+        <w:jc w:val="both"/>
+        <w:rPr>
+          <w:sz w:val="22"/>
+          <w:szCs w:val="22"/>
+        </w:rPr>
+      </w:pPr>
+    </w:p>
+    <w:tbl>
+      <w:tblPr>
+        <w:tblStyle w:val="TableGrid"/>
+        <w:tblW w:w="0" w:type="auto"/>
+        <w:tblBorders>
+          <w:top w:val="none" w:sz="0" w:space="0" w:color="auto"/>
+          <w:left w:val="none" w:sz="0" w:space="0" w:color="auto"/>
+          <w:bottom w:val="none" w:sz="0" w:space="0" w:color="auto"/>
+          <w:right w:val="none" w:sz="0" w:space="0" w:color="auto"/>
+        </w:tblBorders>
+        <w:tblLook w:val="04A0" w:firstRow="1" w:lastRow="0" w:firstColumn="1" w:lastColumn="0" w:noHBand="0" w:noVBand="1"/>
+      </w:tblPr>
+      <w:tblGrid>
+        <w:gridCol w:w="2660"/>
+        <w:gridCol w:w="1701"/>
+        <w:gridCol w:w="1843"/>
+        <w:gridCol w:w="2324"/>
+      </w:tblGrid>
+      <w:tr>
+        <w:tc>
+          <w:tcPr>
+            <w:tcW w:w="2660" w:type="dxa"/>
+          </w:tcPr>
+          <w:p>
+            <w:pPr>
+              <w:jc w:val="center"/>
+              <w:rPr>
+                <w:b/>
+                <w:bCs/>
+                <w:sz w:val="22"/>
+                <w:szCs w:val="22"/>
+              </w:rPr>
+            </w:pPr>
+            <w:r>
+              <w:rPr>
+                <w:b/>
+                <w:bCs/>
+                <w:sz w:val="22"/>
+                <w:szCs w:val="22"/>
+              </w:rPr>
+              <w:t>Model</w:t>
+            </w:r>
+          </w:p>
+        </w:tc>
+        <w:tc>
+          <w:tcPr>
+            <w:tcW w:w="1701" w:type="dxa"/>
+          </w:tcPr>
+          <w:p>
+            <w:pPr>
+              <w:jc w:val="center"/>
+              <w:rPr>
+                <w:b/>
+                <w:bCs/>
+                <w:sz w:val="22"/>
+                <w:szCs w:val="22"/>
+              </w:rPr>
+            </w:pPr>
+            <w:r>
+              <w:rPr>
+                <w:b/>
+                <w:bCs/>
+                <w:sz w:val="22"/>
+                <w:szCs w:val="22"/>
+              </w:rPr>
+              <w:t>CER</w:t>
+            </w:r>
+          </w:p>
+        </w:tc>
+        <w:tc>
+          <w:tcPr>
+            <w:tcW w:w="1843" w:type="dxa"/>
+          </w:tcPr>
+          <w:p>
+            <w:pPr>
+              <w:jc w:val="center"/>
+              <w:rPr>
+                <w:b/>
+                <w:bCs/>
+                <w:sz w:val="22"/>
+                <w:szCs w:val="22"/>
+              </w:rPr>
+            </w:pPr>
+            <w:r>
+              <w:rPr>
+                <w:b/>
+                <w:bCs/>
+                <w:sz w:val="22"/>
+                <w:szCs w:val="22"/>
+              </w:rPr>
+              <w:t>Loss</w:t>
+            </w:r>
+          </w:p>
+        </w:tc>
+        <w:tc>
+          <w:tcPr>
+            <w:tcW w:w="2324" w:type="dxa"/>
+          </w:tcPr>
+          <w:p>
+            <w:pPr>
+              <w:jc w:val="center"/>
+              <w:rPr>
+                <w:b/>
+                <w:bCs/>
+                <w:sz w:val="22"/>
+                <w:szCs w:val="22"/>
+              </w:rPr>
+            </w:pPr>
+            <w:r>
+              <w:rPr>
+                <w:b/>
+                <w:bCs/>
+                <w:sz w:val="22"/>
+                <w:szCs w:val="22"/>
+              </w:rPr>
+              <w:t>Total training time</w:t>
+            </w:r>
+          </w:p>
+        </w:tc>
+      </w:tr>
+      <w:tr>
+        <w:tc>
+          <w:tcPr>
+            <w:tcW w:w="2660" w:type="dxa"/>
+          </w:tcPr>
+          <w:p>
+            <w:pPr>
+              <w:jc w:val="center"/>
+              <w:rPr>
+                <w:b/>
+                <w:bCs/>
+                <w:sz w:val="22"/>
+                <w:szCs w:val="22"/>
+              </w:rPr>
+            </w:pPr>
+            <w:r>
+              <w:rPr>
+                <w:b/>
+                <w:bCs/>
+                <w:sz w:val="22"/>
+                <w:szCs w:val="22"/>
+              </w:rPr>
+              <w:t>CNN-Transformer</w:t>
+            </w:r>
+          </w:p>
+        </w:tc>
+        <w:tc>
+          <w:tcPr>
+            <w:tcW w:w="1701" w:type="dxa"/>
+          </w:tcPr>
+          <w:p>
+            <w:pPr>
+              <w:jc w:val="center"/>
+              <w:rPr>
+                <w:sz w:val="22"/>
+                <w:szCs w:val="22"/>
+              </w:rPr>
+            </w:pPr>
+            <w:r>
+              <w:rPr>
+                <w:sz w:val="22"/>
+                <w:szCs w:val="22"/>
+              </w:rPr>
+              <w:t>2.62%</w:t>
+            </w:r>
+          </w:p>
+        </w:tc>
+        <w:tc>
+          <w:tcPr>
+            <w:tcW w:w="1843" w:type="dxa"/>
+          </w:tcPr>
+          <w:p>
+            <w:pPr>
+              <w:jc w:val="center"/>
+              <w:rPr>
+                <w:sz w:val="22"/>
+                <w:szCs w:val="22"/>
+              </w:rPr>
+            </w:pPr>
+            <w:r>
+              <w:rPr>
+                <w:sz w:val="22"/>
+                <w:szCs w:val="22"/>
+              </w:rPr>
+              <w:t>0.0622</w:t>
+            </w:r>
+          </w:p>
+        </w:tc>
+        <w:tc>
+          <w:tcPr>
+            <w:tcW w:w="2324" w:type="dxa"/>
+          </w:tcPr>
+          <w:p>
+            <w:pPr>
+              <w:jc w:val="center"/>
+              <w:rPr>
+                <w:sz w:val="22"/>
+                <w:szCs w:val="22"/>
+              </w:rPr>
+            </w:pPr>
+            <w:r>
+              <w:rPr>
+                <w:sz w:val="22"/>
+                <w:szCs w:val="22"/>
+              </w:rPr>
+              <w:t>62.22 min</w:t>
+            </w:r>
+          </w:p>
+        </w:tc>
+      </w:tr>
+      <w:tr>
+        <w:tc>
+          <w:tcPr>
+            <w:tcW w:w="2660" w:type="dxa"/>
+          </w:tcPr>
+          <w:p>
+            <w:pPr>
+              <w:jc w:val="center"/>
+              <w:rPr>
+                <w:b/>
+                <w:bCs/>
+                <w:sz w:val="22"/>
+                <w:szCs w:val="22"/>
+              </w:rPr>
+            </w:pPr>
+            <w:r>
+              <w:rPr>
+                <w:b/>
+                <w:bCs/>
+                <w:sz w:val="22"/>
+                <w:szCs w:val="22"/>
+              </w:rPr>
+              <w:t>HFF-CNN-Transformer</w:t>
+            </w:r>
+          </w:p>
+        </w:tc>
+        <w:tc>
+          <w:tcPr>
+            <w:tcW w:w="1701" w:type="dxa"/>
+          </w:tcPr>
+          <w:p>
+            <w:pPr>
+              <w:jc w:val="center"/>
+              <w:rPr>
+                <w:sz w:val="22"/>
+                <w:szCs w:val="22"/>
+              </w:rPr>
+            </w:pPr>
+            <w:r>
+              <w:rPr>
+                <w:sz w:val="22"/>
+                <w:szCs w:val="22"/>
+              </w:rPr>
+              <w:t>2.44%</w:t>
+            </w:r>
+          </w:p>
+        </w:tc>
+        <w:tc>
+          <w:tcPr>
+            <w:tcW w:w="1843" w:type="dxa"/>
+          </w:tcPr>
+          <w:p>
+            <w:pPr>
+              <w:jc w:val="center"/>
+              <w:rPr>
+                <w:sz w:val="22"/>
+                <w:szCs w:val="22"/>
+              </w:rPr>
+            </w:pPr>
+            <w:r>
+              <w:rPr>
+                <w:sz w:val="22"/>
+                <w:szCs w:val="22"/>
+              </w:rPr>
+              <w:t>0.0570</w:t>
+            </w:r>
+          </w:p>
+        </w:tc>
+        <w:tc>
+          <w:tcPr>
+            <w:tcW w:w="2324" w:type="dxa"/>
+          </w:tcPr>
+          <w:p>
+            <w:pPr>
+              <w:jc w:val="center"/>
+              <w:rPr>
+                <w:sz w:val="22"/>
+                <w:szCs w:val="22"/>
+              </w:rPr>
+            </w:pPr>
+            <w:r>
+              <w:rPr>
+                <w:sz w:val="22"/>
+                <w:szCs w:val="22"/>
+              </w:rPr>
+              <w:t>67.22 min</w:t>
+            </w:r>
+          </w:p>
+        </w:tc>
+      </w:tr>
+    </w:tbl>
+    <w:p>
+      <w:pPr>
+        <w:ind w:firstLine="360"/>
+        <w:jc w:val="center"/>
+        <w:rPr>
+          <w:b/>
+          <w:sz w:val="20"/>
+          <w:szCs w:val="20"/>
+        </w:rPr>
+      </w:pPr>
+    </w:p>
+    <w:p>
+      <w:pPr>
+        <w:ind w:firstLine="360"/>
+        <w:jc w:val="center"/>
+        <w:rPr>
+          <w:sz w:val="20"/>
+          <w:szCs w:val="20"/>
+        </w:rPr>
+      </w:pPr>
+      <w:r>
+        <w:rPr>
+          <w:b/>
+          <w:sz w:val="20"/>
+          <w:szCs w:val="20"/>
+        </w:rPr>
+        <w:t>Table 1.</w:t>
+      </w:r>
+      <w:r>
+        <w:rPr>
+          <w:sz w:val="20"/>
+          <w:szCs w:val="20"/>
         </w:rPr>
         <w:t xml:space="preserve"> </w:t>
       </w:r>
@@ -1962,365 +2700,106 @@
           <w:sz w:val="22"/>
           <w:szCs w:val="22"/>
         </w:rPr>
-        <w:t>The HFF-CNN-Transformer contains approximately 2</w:t>
-      </w:r>
-      <w:r>
-        <w:rPr>
-          <w:sz w:val="22"/>
-          <w:szCs w:val="22"/>
-        </w:rPr>
-        <w:t>5.6</w:t>
-      </w:r>
-      <w:r>
-        <w:rPr>
-          <w:sz w:val="22"/>
-          <w:szCs w:val="22"/>
-        </w:rPr>
-        <w:t xml:space="preserve"> million trainable parameters</w:t>
-      </w:r>
-      <w:r>
-        <w:rPr>
-          <w:sz w:val="22"/>
-          <w:szCs w:val="22"/>
-        </w:rPr>
-        <w:t>.</w:t>
-      </w:r>
-    </w:p>
-    <w:p>
-      <w:pPr>
-        <w:jc w:val="both"/>
-        <w:rPr>
-          <w:i/>
-          <w:sz w:val="22"/>
-          <w:szCs w:val="22"/>
-        </w:rPr>
-      </w:pPr>
-    </w:p>
-    <w:p>
-      <w:pPr>
-        <w:jc w:val="both"/>
-        <w:rPr>
-          <w:i/>
-          <w:sz w:val="22"/>
-          <w:szCs w:val="22"/>
-        </w:rPr>
-      </w:pPr>
-      <w:r>
-        <w:rPr>
-          <w:i/>
-          <w:sz w:val="22"/>
-          <w:szCs w:val="22"/>
-        </w:rPr>
-        <w:t>2.4 Training</w:t>
-      </w:r>
-      <w:r>
-        <w:rPr>
-          <w:i/>
-          <w:sz w:val="22"/>
-          <w:szCs w:val="22"/>
-        </w:rPr>
-        <w:t xml:space="preserve"> Procedure</w:t>
-      </w:r>
-    </w:p>
-    <w:p>
-      <w:pPr>
-        <w:jc w:val="both"/>
-        <w:rPr>
-          <w:i/>
-          <w:sz w:val="22"/>
-          <w:szCs w:val="22"/>
-        </w:rPr>
-      </w:pPr>
-    </w:p>
-    <w:p>
-      <w:pPr>
-        <w:ind w:firstLine="720"/>
-        <w:jc w:val="both"/>
-        <w:rPr>
-          <w:sz w:val="22"/>
-          <w:szCs w:val="22"/>
-        </w:rPr>
-      </w:pPr>
-      <w:r>
-        <w:rPr>
-          <w:sz w:val="22"/>
-          <w:szCs w:val="22"/>
-        </w:rPr>
-        <w:t xml:space="preserve">Both </w:t>
-      </w:r>
-      <w:r>
-        <w:rPr>
-          <w:sz w:val="22"/>
-          <w:szCs w:val="22"/>
-        </w:rPr>
-        <w:t>models are trained under identical conditions to ensure a fair and reproducible comparison. The dataset is partitioned into three non-overlapping subsets: 80% for training, 10% for validation, and 10% for testing, using a fixed random split.</w:t>
-      </w:r>
-    </w:p>
-    <w:p>
-      <w:pPr>
-        <w:ind w:firstLine="720"/>
-        <w:jc w:val="both"/>
-        <w:rPr>
-          <w:sz w:val="22"/>
-          <w:szCs w:val="22"/>
-        </w:rPr>
-      </w:pPr>
-      <w:r>
-        <w:rPr>
-          <w:sz w:val="22"/>
-          <w:szCs w:val="22"/>
-        </w:rPr>
-        <w:t xml:space="preserve">Both models are optimized using </w:t>
-      </w:r>
-      <w:proofErr w:type="spellStart"/>
-      <w:r>
-        <w:rPr>
-          <w:sz w:val="22"/>
-          <w:szCs w:val="22"/>
-        </w:rPr>
-        <w:t>AdamW</w:t>
-      </w:r>
-      <w:proofErr w:type="spellEnd"/>
-      <w:r>
-        <w:rPr>
-          <w:sz w:val="22"/>
-          <w:szCs w:val="22"/>
-        </w:rPr>
-        <w:t xml:space="preserve"> with a peak learning rate of 7×10⁻⁵ and a weight decay of 10⁻² for L2 regularization. The learning rate schedule consists of a linear warmup phase over the first 3 epochs, during which the learning rate increases to the peak value, followed by cosine decay down to </w:t>
-      </w:r>
-      <w:r>
-        <w:rPr>
-          <w:sz w:val="22"/>
-          <w:szCs w:val="22"/>
-        </w:rPr>
-        <w:t>1</w:t>
-      </w:r>
-      <w:r>
-        <w:rPr>
-          <w:sz w:val="22"/>
-          <w:szCs w:val="22"/>
-        </w:rPr>
-        <w:t xml:space="preserve">% of the peak learning rate over the remaining 12 epochs. Training is conducted for 15 epochs with a batch size of 128 on an NVIDIA L4 GPU. </w:t>
-      </w:r>
-      <w:r>
-        <w:rPr>
-          <w:sz w:val="22"/>
-          <w:szCs w:val="22"/>
-        </w:rPr>
-        <w:t>Automatic Mixed Precision (AMP) with float16 is enabled during the training forward and backward pass to reduce memory usage and accelerate computation, with gradient scaling applied to prevent underflow. Validation and test evaluation are performed in full float32 precision</w:t>
-      </w:r>
-      <w:r>
-        <w:rPr>
-          <w:sz w:val="22"/>
-          <w:szCs w:val="22"/>
-        </w:rPr>
-        <w:t>. Gradient clipping with a maximum norm of 5.0 is applied at each update step to prevent exploding gradients.</w:t>
-      </w:r>
-    </w:p>
-    <w:p>
-      <w:pPr>
-        <w:ind w:firstLine="720"/>
-        <w:jc w:val="both"/>
-        <w:rPr>
-          <w:sz w:val="22"/>
-          <w:szCs w:val="22"/>
-        </w:rPr>
-      </w:pPr>
-      <w:r>
-        <w:rPr>
-          <w:sz w:val="22"/>
-          <w:szCs w:val="22"/>
-        </w:rPr>
-        <w:t xml:space="preserve">The loss function used for training is Connectionist Temporal Classification (CTC) loss with the blank token assigned to index 0. The </w:t>
-      </w:r>
-      <w:proofErr w:type="spellStart"/>
-      <w:r>
-        <w:rPr>
-          <w:sz w:val="22"/>
-          <w:szCs w:val="22"/>
-        </w:rPr>
-        <w:t>zero_infinity</w:t>
-      </w:r>
-      <w:proofErr w:type="spellEnd"/>
-      <w:r>
-        <w:rPr>
-          <w:sz w:val="22"/>
-          <w:szCs w:val="22"/>
-        </w:rPr>
-        <w:t xml:space="preserve"> flag is enabled to suppress infinite loss values that may arise from numerically unstable alignments, improving training stability.</w:t>
-      </w:r>
-    </w:p>
-    <w:p>
-      <w:pPr>
-        <w:ind w:firstLine="720"/>
-        <w:jc w:val="both"/>
-        <w:rPr>
-          <w:sz w:val="22"/>
-          <w:szCs w:val="22"/>
-        </w:rPr>
-      </w:pPr>
-      <w:r>
-        <w:rPr>
-          <w:sz w:val="22"/>
-          <w:szCs w:val="22"/>
-        </w:rPr>
-        <w:t>At the end of each epoch, the model is evaluated on the validation set. The checkpoint corresponding to the lowest validation CER across all epochs is saved and subsequently loaded for final evaluation on the held-out test set.</w:t>
-      </w:r>
-    </w:p>
-    <w:p>
-      <w:pPr>
-        <w:jc w:val="both"/>
-        <w:rPr>
-          <w:sz w:val="22"/>
-          <w:szCs w:val="22"/>
-        </w:rPr>
-      </w:pPr>
-    </w:p>
-    <w:p>
-      <w:pPr>
-        <w:jc w:val="both"/>
-        <w:rPr>
-          <w:b/>
-          <w:sz w:val="22"/>
-          <w:szCs w:val="22"/>
-        </w:rPr>
-      </w:pPr>
-      <w:r>
-        <w:rPr>
-          <w:b/>
-          <w:sz w:val="22"/>
-          <w:szCs w:val="22"/>
-        </w:rPr>
-        <w:t xml:space="preserve">3. </w:t>
-      </w:r>
-      <w:r>
-        <w:rPr>
-          <w:b/>
-          <w:sz w:val="22"/>
-          <w:szCs w:val="22"/>
-        </w:rPr>
         <w:t>Results</w:t>
       </w:r>
-    </w:p>
-    <w:p>
-      <w:pPr>
-        <w:jc w:val="both"/>
-        <w:rPr>
-          <w:b/>
-          <w:sz w:val="22"/>
-          <w:szCs w:val="22"/>
-        </w:rPr>
-      </w:pPr>
-    </w:p>
-    <w:p>
-      <w:pPr>
-        <w:jc w:val="both"/>
-        <w:rPr>
-          <w:sz w:val="22"/>
-          <w:szCs w:val="22"/>
-        </w:rPr>
-      </w:pPr>
-      <w:r>
-        <w:rPr>
-          <w:sz w:val="22"/>
-          <w:szCs w:val="22"/>
-        </w:rPr>
-        <w:t>This section presents the experimental results obtained by training and evaluating both models under the conditions described in Section 2.4. Performance is measured using Character Error Rate (CER), computed as the edit distance between the predicted and ground truth character sequences normalized by the ground truth length, and CTC loss evaluated on the held-out test set. Lower values indicate better performance for both metrics.</w:t>
-      </w:r>
-    </w:p>
-    <w:p>
-      <w:pPr>
-        <w:jc w:val="both"/>
-        <w:rPr>
-          <w:sz w:val="22"/>
-          <w:szCs w:val="22"/>
-        </w:rPr>
-      </w:pPr>
+      <w:r>
+        <w:rPr>
+          <w:sz w:val="20"/>
+          <w:szCs w:val="20"/>
+        </w:rPr>
+        <w:t xml:space="preserve"> </w:t>
+      </w:r>
+    </w:p>
+    <w:p>
+      <w:pPr>
+        <w:ind w:firstLine="360"/>
+        <w:jc w:val="center"/>
+        <w:rPr>
+          <w:sz w:val="20"/>
+          <w:szCs w:val="20"/>
+        </w:rPr>
+      </w:pPr>
+    </w:p>
+    <w:p>
+      <w:pPr>
+        <w:jc w:val="both"/>
+        <w:rPr>
+          <w:sz w:val="22"/>
+          <w:szCs w:val="22"/>
+        </w:rPr>
+      </w:pPr>
+      <w:r>
+        <w:rPr>
+          <w:sz w:val="22"/>
+          <w:szCs w:val="22"/>
+        </w:rPr>
+        <w:t xml:space="preserve">Table </w:t>
+      </w:r>
+      <w:r>
+        <w:rPr>
+          <w:sz w:val="22"/>
+          <w:szCs w:val="22"/>
+        </w:rPr>
+        <w:t>1.</w:t>
+      </w:r>
+      <w:r>
+        <w:rPr>
+          <w:sz w:val="22"/>
+          <w:szCs w:val="22"/>
+        </w:rPr>
+        <w:t xml:space="preserve"> summarizes the results for both models. The HFF-CNN-Transformer outperforms the baseline across all reported metrics, achieving a best validation CER of 2.39% at epoch 13 compared to 2.60% at epoch 14 for the baseline. On the test set, the HFF model achieves a CER of 2.44% and a loss of 0.0570, compared to 2.62% and 0.0622 for the baseline CNN-Transformer. The relative improvement in test CER is 6.87%, obtained with identical hyperparameters and training conditions, confirming that the performance gain is attributable solely to the hierarchical feature fusion mechanism and adaptive sequence masking.</w:t>
+      </w:r>
+    </w:p>
+    <w:p>
+      <w:pPr>
+        <w:ind w:firstLine="360"/>
+        <w:rPr>
+          <w:sz w:val="20"/>
+          <w:szCs w:val="20"/>
+        </w:rPr>
+      </w:pPr>
+      <w:r>
+        <w:rPr>
+          <w:sz w:val="22"/>
+          <w:szCs w:val="22"/>
+        </w:rPr>
+        <w:t xml:space="preserve">Figure </w:t>
+      </w:r>
+      <w:r>
+        <w:rPr>
+          <w:sz w:val="22"/>
+          <w:szCs w:val="22"/>
+        </w:rPr>
+        <w:t>3</w:t>
+      </w:r>
+      <w:r>
+        <w:rPr>
+          <w:sz w:val="22"/>
+          <w:szCs w:val="22"/>
+        </w:rPr>
+        <w:t xml:space="preserve"> illustrates the validation of CER progression across all 15 training epochs for both models. The HFF-CNN-Transformer demonstrates lower validation CER from epoch </w:t>
+      </w:r>
+      <w:r>
+        <w:rPr>
+          <w:sz w:val="22"/>
+          <w:szCs w:val="22"/>
+        </w:rPr>
+        <w:t>4</w:t>
+      </w:r>
+      <w:r>
+        <w:rPr>
+          <w:sz w:val="22"/>
+          <w:szCs w:val="22"/>
+        </w:rPr>
+        <w:t xml:space="preserve"> onward, with both models stabilizing in the final epochs as the learning rate approaches its </w:t>
+      </w:r>
       <w:r>
         <w:rPr>
           <w:sz w:val="22"/>
           <w:szCs w:val="22"/>
         </w:rPr>
         <w:lastRenderedPageBreak/>
-        <w:t xml:space="preserve">Table II summarizes the </w:t>
-      </w:r>
-      <w:proofErr w:type="gramStart"/>
-      <w:r>
-        <w:rPr>
-          <w:sz w:val="22"/>
-          <w:szCs w:val="22"/>
-        </w:rPr>
-        <w:t>final results</w:t>
-      </w:r>
-      <w:proofErr w:type="gramEnd"/>
-      <w:r>
-        <w:rPr>
-          <w:sz w:val="22"/>
-          <w:szCs w:val="22"/>
-        </w:rPr>
-        <w:t xml:space="preserve"> for both models. The HFF-CNN-Transformer outperforms the baseline across all reported metrics, achieving a best validation CER of 2.39% at epoch 13 compared to 2.60% at epoch 14 for the baseline. On the test set, the HFF model achieves a CER of 2.44% and a loss of 0.0570, compared to 2.62% and 0.0622 for the baseline CNN-Transformer. The relative improvement in test CER is 6.87%, obtained with identical hyperparameters and training conditions, confirming that the performance gain is attributable solely to the hierarchical feature fusion mechanism and adaptive sequence masking.</w:t>
-      </w:r>
-    </w:p>
-    <w:p>
-      <w:pPr>
-        <w:jc w:val="both"/>
-        <w:rPr>
-          <w:sz w:val="22"/>
-          <w:szCs w:val="22"/>
-        </w:rPr>
-      </w:pPr>
-      <w:r>
-        <w:rPr>
-          <w:sz w:val="22"/>
-          <w:szCs w:val="22"/>
-        </w:rPr>
-        <w:t xml:space="preserve">Figure 1 illustrates the </w:t>
-      </w:r>
-      <w:proofErr w:type="gramStart"/>
-      <w:r>
-        <w:rPr>
-          <w:sz w:val="22"/>
-          <w:szCs w:val="22"/>
-        </w:rPr>
-        <w:t>validation</w:t>
-      </w:r>
-      <w:proofErr w:type="gramEnd"/>
-      <w:r>
-        <w:rPr>
-          <w:sz w:val="22"/>
-          <w:szCs w:val="22"/>
-        </w:rPr>
-        <w:t xml:space="preserve"> CER progression across all 15 training epochs for both models. The HFF-CNN-Transformer demonstrates lower validation CER from epoch </w:t>
-      </w:r>
-      <w:r>
-        <w:rPr>
-          <w:sz w:val="22"/>
-          <w:szCs w:val="22"/>
-        </w:rPr>
-        <w:t>4</w:t>
-      </w:r>
-      <w:r>
-        <w:rPr>
-          <w:sz w:val="22"/>
-          <w:szCs w:val="22"/>
-        </w:rPr>
-        <w:t xml:space="preserve"> onward, with both models stabilizing in the final </w:t>
-      </w:r>
-      <w:proofErr w:type="gramStart"/>
-      <w:r>
-        <w:rPr>
-          <w:sz w:val="22"/>
-          <w:szCs w:val="22"/>
-        </w:rPr>
-        <w:t>epochs</w:t>
-      </w:r>
-      <w:proofErr w:type="gramEnd"/>
-      <w:r>
-        <w:rPr>
-          <w:sz w:val="22"/>
-          <w:szCs w:val="22"/>
-        </w:rPr>
-        <w:t xml:space="preserve"> as the learning rate approaches its minimum value. The baseline model reaches its best validation performance at epoch 14, suggesting slower convergence, while the HFF model achieves its best result at epoch 13.</w:t>
+        <w:t>minimum value. The baseline model reaches its best validation performance at epoch 14, suggesting slower convergence, while the HFF model achieves its best result at epoch 13.</w:t>
       </w:r>
     </w:p>
     <w:p>
@@ -2362,7 +2841,7 @@
                     <pic:cNvPicPr/>
                   </pic:nvPicPr>
                   <pic:blipFill>
-                    <a:blip r:embed="rId9">
+                    <a:blip r:embed="rId13">
                       <a:extLst>
                         <a:ext uri="{28A0092B-C50C-407E-A947-70E740481C1C}">
                           <a14:useLocalDpi xmlns:a14="http://schemas.microsoft.com/office/drawing/2010/main" val="0"/>
@@ -2412,7 +2891,15 @@
           <w:sz w:val="20"/>
           <w:szCs w:val="20"/>
         </w:rPr>
-        <w:t xml:space="preserve"> 1</w:t>
+        <w:t xml:space="preserve"> </w:t>
+      </w:r>
+      <w:r>
+        <w:rPr>
+          <w:b/>
+          <w:sz w:val="20"/>
+          <w:szCs w:val="20"/>
+        </w:rPr>
+        <w:t>3</w:t>
       </w:r>
       <w:r>
         <w:rPr>
@@ -2459,7 +2946,21 @@
           <w:sz w:val="22"/>
           <w:szCs w:val="22"/>
         </w:rPr>
-        <w:t xml:space="preserve">Figure 2 presents </w:t>
+        <w:t xml:space="preserve">Figure </w:t>
+      </w:r>
+      <w:r>
+        <w:rPr>
+          <w:sz w:val="22"/>
+          <w:szCs w:val="22"/>
+        </w:rPr>
+        <w:t>4</w:t>
+      </w:r>
+      <w:r>
+        <w:rPr>
+          <w:sz w:val="22"/>
+          <w:szCs w:val="22"/>
+        </w:rPr>
+        <w:t xml:space="preserve"> presents </w:t>
       </w:r>
       <w:r>
         <w:rPr>
@@ -2537,7 +3038,7 @@
                     <pic:cNvPicPr/>
                   </pic:nvPicPr>
                   <pic:blipFill>
-                    <a:blip r:embed="rId10">
+                    <a:blip r:embed="rId14">
                       <a:extLst>
                         <a:ext uri="{28A0092B-C50C-407E-A947-70E740481C1C}">
                           <a14:useLocalDpi xmlns:a14="http://schemas.microsoft.com/office/drawing/2010/main" val="0"/>
@@ -2595,7 +3096,7 @@
           <w:sz w:val="20"/>
           <w:szCs w:val="20"/>
         </w:rPr>
-        <w:t>2</w:t>
+        <w:t>4</w:t>
       </w:r>
       <w:r>
         <w:rPr>
@@ -2648,15 +3149,7 @@
           <w:sz w:val="22"/>
           <w:szCs w:val="22"/>
         </w:rPr>
-        <w:t xml:space="preserve">of approximately 8% relative to the baseline. Given the consistent </w:t>
-      </w:r>
-      <w:r>
-        <w:rPr>
-          <w:sz w:val="22"/>
-          <w:szCs w:val="22"/>
-        </w:rPr>
-        <w:lastRenderedPageBreak/>
-        <w:t xml:space="preserve">improvement across all evaluation metrics, this </w:t>
+        <w:t xml:space="preserve">of approximately 8% relative to the baseline. Given the consistent improvement across all evaluation metrics, this </w:t>
       </w:r>
       <w:r>
         <w:rPr>
@@ -2671,6 +3164,649 @@
           <w:szCs w:val="22"/>
         </w:rPr>
         <w:t>is considered acceptable.</w:t>
+      </w:r>
+    </w:p>
+    <w:p>
+      <w:pPr>
+        <w:jc w:val="both"/>
+        <w:rPr>
+          <w:sz w:val="22"/>
+          <w:szCs w:val="22"/>
+        </w:rPr>
+      </w:pPr>
+    </w:p>
+    <w:p>
+      <w:pPr>
+        <w:jc w:val="both"/>
+        <w:rPr>
+          <w:sz w:val="22"/>
+          <w:szCs w:val="22"/>
+        </w:rPr>
+      </w:pPr>
+      <w:r>
+        <w:rPr>
+          <w:sz w:val="22"/>
+          <w:szCs w:val="22"/>
+        </w:rPr>
+        <w:t xml:space="preserve">To further evaluate model performance beyond aggregate metrics, a qualitative comparison was conducted on a set of representative test images </w:t>
+      </w:r>
+      <w:r>
+        <w:rPr>
+          <w:sz w:val="22"/>
+          <w:szCs w:val="22"/>
+        </w:rPr>
+        <w:t>with different</w:t>
+      </w:r>
+      <w:r>
+        <w:rPr>
+          <w:sz w:val="22"/>
+          <w:szCs w:val="22"/>
+        </w:rPr>
+        <w:t xml:space="preserve"> difficulty categories: common words, random strings, numeric strings, handwritten-style text, and low legibility text. Figure</w:t>
+      </w:r>
+      <w:r>
+        <w:rPr>
+          <w:sz w:val="22"/>
+          <w:szCs w:val="22"/>
+        </w:rPr>
+        <w:t>s</w:t>
+      </w:r>
+      <w:r>
+        <w:rPr>
+          <w:sz w:val="22"/>
+          <w:szCs w:val="22"/>
+        </w:rPr>
+        <w:t xml:space="preserve"> </w:t>
+      </w:r>
+      <w:r>
+        <w:rPr>
+          <w:sz w:val="22"/>
+          <w:szCs w:val="22"/>
+        </w:rPr>
+        <w:t>below</w:t>
+      </w:r>
+      <w:r>
+        <w:rPr>
+          <w:sz w:val="22"/>
+          <w:szCs w:val="22"/>
+        </w:rPr>
+        <w:t xml:space="preserve"> present side-by-side predictions of the CNN-Transformer baseline and the proposed HFF-CNN-Transformer model.</w:t>
+      </w:r>
+    </w:p>
+    <w:p>
+      <w:pPr>
+        <w:jc w:val="both"/>
+        <w:rPr>
+          <w:sz w:val="22"/>
+          <w:szCs w:val="22"/>
+        </w:rPr>
+      </w:pPr>
+    </w:p>
+    <w:p>
+      <w:pPr>
+        <w:jc w:val="both"/>
+        <w:rPr>
+          <w:sz w:val="22"/>
+          <w:szCs w:val="22"/>
+        </w:rPr>
+      </w:pPr>
+      <w:r>
+        <w:rPr>
+          <w:noProof/>
+          <w:sz w:val="22"/>
+          <w:szCs w:val="22"/>
+        </w:rPr>
+        <w:drawing>
+          <wp:inline distT="0" distB="0" distL="0" distR="0" wp14:anchorId="26B87551" wp14:editId="0CF3DBB9">
+            <wp:extent cx="5271135" cy="389890"/>
+            <wp:effectExtent l="0" t="0" r="5715" b="0"/>
+            <wp:docPr id="1239771296" name="Picture 1"/>
+            <wp:cNvGraphicFramePr>
+              <a:graphicFrameLocks xmlns:a="http://schemas.openxmlformats.org/drawingml/2006/main" noChangeAspect="1"/>
+            </wp:cNvGraphicFramePr>
+            <a:graphic xmlns:a="http://schemas.openxmlformats.org/drawingml/2006/main">
+              <a:graphicData uri="http://schemas.openxmlformats.org/drawingml/2006/picture">
+                <pic:pic xmlns:pic="http://schemas.openxmlformats.org/drawingml/2006/picture">
+                  <pic:nvPicPr>
+                    <pic:cNvPr id="0" name="Picture 2"/>
+                    <pic:cNvPicPr>
+                      <a:picLocks noChangeAspect="1" noChangeArrowheads="1"/>
+                    </pic:cNvPicPr>
+                  </pic:nvPicPr>
+                  <pic:blipFill>
+                    <a:blip r:embed="rId15" cstate="print">
+                      <a:extLst>
+                        <a:ext uri="{28A0092B-C50C-407E-A947-70E740481C1C}">
+                          <a14:useLocalDpi xmlns:a14="http://schemas.microsoft.com/office/drawing/2010/main" val="0"/>
+                        </a:ext>
+                      </a:extLst>
+                    </a:blip>
+                    <a:srcRect/>
+                    <a:stretch>
+                      <a:fillRect/>
+                    </a:stretch>
+                  </pic:blipFill>
+                  <pic:spPr bwMode="auto">
+                    <a:xfrm>
+                      <a:off x="0" y="0"/>
+                      <a:ext cx="5271135" cy="389890"/>
+                    </a:xfrm>
+                    <a:prstGeom prst="rect">
+                      <a:avLst/>
+                    </a:prstGeom>
+                    <a:noFill/>
+                    <a:ln>
+                      <a:noFill/>
+                    </a:ln>
+                  </pic:spPr>
+                </pic:pic>
+              </a:graphicData>
+            </a:graphic>
+          </wp:inline>
+        </w:drawing>
+      </w:r>
+    </w:p>
+    <w:p>
+      <w:pPr>
+        <w:tabs>
+          <w:tab w:val="center" w:pos="4336"/>
+          <w:tab w:val="left" w:pos="6120"/>
+        </w:tabs>
+        <w:ind w:firstLine="360"/>
+        <w:rPr>
+          <w:sz w:val="20"/>
+          <w:szCs w:val="20"/>
+        </w:rPr>
+      </w:pPr>
+      <w:r>
+        <w:rPr>
+          <w:b/>
+          <w:sz w:val="20"/>
+          <w:szCs w:val="20"/>
+        </w:rPr>
+        <w:tab/>
+        <w:t>Figure</w:t>
+      </w:r>
+      <w:r>
+        <w:rPr>
+          <w:b/>
+          <w:sz w:val="20"/>
+          <w:szCs w:val="20"/>
+        </w:rPr>
+        <w:t xml:space="preserve"> </w:t>
+      </w:r>
+      <w:r>
+        <w:rPr>
+          <w:b/>
+          <w:sz w:val="20"/>
+          <w:szCs w:val="20"/>
+        </w:rPr>
+        <w:t>5</w:t>
+      </w:r>
+      <w:r>
+        <w:rPr>
+          <w:sz w:val="20"/>
+          <w:szCs w:val="20"/>
+        </w:rPr>
+        <w:t>.</w:t>
+      </w:r>
+      <w:r>
+        <w:rPr>
+          <w:sz w:val="20"/>
+          <w:szCs w:val="20"/>
+        </w:rPr>
+        <w:t xml:space="preserve"> Common words and random string</w:t>
+      </w:r>
+      <w:r>
+        <w:rPr>
+          <w:sz w:val="20"/>
+          <w:szCs w:val="20"/>
+        </w:rPr>
+        <w:tab/>
+      </w:r>
+    </w:p>
+    <w:p>
+      <w:pPr>
+        <w:tabs>
+          <w:tab w:val="center" w:pos="4336"/>
+          <w:tab w:val="left" w:pos="6120"/>
+        </w:tabs>
+        <w:ind w:firstLine="360"/>
+        <w:rPr>
+          <w:sz w:val="20"/>
+          <w:szCs w:val="20"/>
+        </w:rPr>
+      </w:pPr>
+    </w:p>
+    <w:p>
+      <w:pPr>
+        <w:tabs>
+          <w:tab w:val="center" w:pos="4336"/>
+          <w:tab w:val="left" w:pos="6120"/>
+        </w:tabs>
+        <w:rPr>
+          <w:sz w:val="20"/>
+          <w:szCs w:val="20"/>
+        </w:rPr>
+      </w:pPr>
+      <w:r>
+        <w:rPr>
+          <w:sz w:val="20"/>
+          <w:szCs w:val="20"/>
+        </w:rPr>
+        <w:t xml:space="preserve">Figure </w:t>
+      </w:r>
+      <w:r>
+        <w:rPr>
+          <w:sz w:val="20"/>
+          <w:szCs w:val="20"/>
+        </w:rPr>
+        <w:t>5</w:t>
+      </w:r>
+      <w:r>
+        <w:rPr>
+          <w:sz w:val="20"/>
+          <w:szCs w:val="20"/>
+        </w:rPr>
+        <w:t xml:space="preserve"> shows predictions on common words with background noise and random alphanumeric strings with mixed fonts. For "Program Files", the baseline omits the letter "l", predicting "Program Fies", while the HFF model produces "Program Fi1es" — substituting "l" with the digit "1" due to visual similarity in the given font. For the random string </w:t>
+      </w:r>
+      <w:r>
+        <w:rPr>
+          <w:i/>
+          <w:iCs/>
+          <w:sz w:val="20"/>
+          <w:szCs w:val="20"/>
+        </w:rPr>
+        <w:t>N9d4NW1wne</w:t>
+      </w:r>
+      <w:r>
+        <w:rPr>
+          <w:sz w:val="20"/>
+          <w:szCs w:val="20"/>
+        </w:rPr>
+        <w:t>, the baseline fails to recognize the leading uppercase "N", outputting "9d4w1wne", whereas the HFF model correctly predicts the full string. This result highlights a key advantage of the proposed architecture</w:t>
+      </w:r>
+      <w:r>
+        <w:rPr>
+          <w:sz w:val="20"/>
+          <w:szCs w:val="20"/>
+        </w:rPr>
+        <w:t>,</w:t>
+      </w:r>
+      <w:r>
+        <w:rPr>
+          <w:sz w:val="20"/>
+          <w:szCs w:val="20"/>
+        </w:rPr>
+        <w:t xml:space="preserve"> the multi-scale feature representation preserves fine-grained spatial details that are critical for recognizing visually ambiguous characters at string boundaries.</w:t>
+      </w:r>
+    </w:p>
+    <w:p>
+      <w:pPr>
+        <w:tabs>
+          <w:tab w:val="center" w:pos="4336"/>
+          <w:tab w:val="left" w:pos="6120"/>
+        </w:tabs>
+        <w:rPr>
+          <w:sz w:val="20"/>
+          <w:szCs w:val="20"/>
+        </w:rPr>
+      </w:pPr>
+    </w:p>
+    <w:p>
+      <w:pPr>
+        <w:tabs>
+          <w:tab w:val="center" w:pos="4336"/>
+          <w:tab w:val="left" w:pos="6120"/>
+        </w:tabs>
+        <w:rPr>
+          <w:sz w:val="20"/>
+          <w:szCs w:val="20"/>
+        </w:rPr>
+      </w:pPr>
+      <w:r>
+        <w:rPr>
+          <w:noProof/>
+          <w:sz w:val="20"/>
+          <w:szCs w:val="20"/>
+        </w:rPr>
+        <w:drawing>
+          <wp:inline distT="0" distB="0" distL="0" distR="0" wp14:anchorId="1BAC5C66" wp14:editId="10C5BD17">
+            <wp:extent cx="5271135" cy="389890"/>
+            <wp:effectExtent l="0" t="0" r="5715" b="0"/>
+            <wp:docPr id="322725039" name="Picture 2"/>
+            <wp:cNvGraphicFramePr>
+              <a:graphicFrameLocks xmlns:a="http://schemas.openxmlformats.org/drawingml/2006/main" noChangeAspect="1"/>
+            </wp:cNvGraphicFramePr>
+            <a:graphic xmlns:a="http://schemas.openxmlformats.org/drawingml/2006/main">
+              <a:graphicData uri="http://schemas.openxmlformats.org/drawingml/2006/picture">
+                <pic:pic xmlns:pic="http://schemas.openxmlformats.org/drawingml/2006/picture">
+                  <pic:nvPicPr>
+                    <pic:cNvPr id="0" name="Picture 3"/>
+                    <pic:cNvPicPr>
+                      <a:picLocks noChangeAspect="1" noChangeArrowheads="1"/>
+                    </pic:cNvPicPr>
+                  </pic:nvPicPr>
+                  <pic:blipFill>
+                    <a:blip r:embed="rId16" cstate="print">
+                      <a:extLst>
+                        <a:ext uri="{28A0092B-C50C-407E-A947-70E740481C1C}">
+                          <a14:useLocalDpi xmlns:a14="http://schemas.microsoft.com/office/drawing/2010/main" val="0"/>
+                        </a:ext>
+                      </a:extLst>
+                    </a:blip>
+                    <a:srcRect/>
+                    <a:stretch>
+                      <a:fillRect/>
+                    </a:stretch>
+                  </pic:blipFill>
+                  <pic:spPr bwMode="auto">
+                    <a:xfrm>
+                      <a:off x="0" y="0"/>
+                      <a:ext cx="5271135" cy="389890"/>
+                    </a:xfrm>
+                    <a:prstGeom prst="rect">
+                      <a:avLst/>
+                    </a:prstGeom>
+                    <a:noFill/>
+                    <a:ln>
+                      <a:noFill/>
+                    </a:ln>
+                  </pic:spPr>
+                </pic:pic>
+              </a:graphicData>
+            </a:graphic>
+          </wp:inline>
+        </w:drawing>
+      </w:r>
+    </w:p>
+    <w:p>
+      <w:pPr>
+        <w:tabs>
+          <w:tab w:val="center" w:pos="4336"/>
+          <w:tab w:val="left" w:pos="6120"/>
+        </w:tabs>
+        <w:ind w:firstLine="360"/>
+        <w:rPr>
+          <w:sz w:val="20"/>
+          <w:szCs w:val="20"/>
+        </w:rPr>
+      </w:pPr>
+      <w:r>
+        <w:rPr>
+          <w:b/>
+          <w:sz w:val="20"/>
+          <w:szCs w:val="20"/>
+        </w:rPr>
+        <w:tab/>
+        <w:t>Figure</w:t>
+      </w:r>
+      <w:r>
+        <w:rPr>
+          <w:b/>
+          <w:sz w:val="20"/>
+          <w:szCs w:val="20"/>
+        </w:rPr>
+        <w:t xml:space="preserve"> </w:t>
+      </w:r>
+      <w:r>
+        <w:rPr>
+          <w:b/>
+          <w:sz w:val="20"/>
+          <w:szCs w:val="20"/>
+        </w:rPr>
+        <w:t>6</w:t>
+      </w:r>
+      <w:r>
+        <w:rPr>
+          <w:sz w:val="20"/>
+          <w:szCs w:val="20"/>
+        </w:rPr>
+        <w:t>.</w:t>
+      </w:r>
+      <w:r>
+        <w:rPr>
+          <w:sz w:val="20"/>
+          <w:szCs w:val="20"/>
+        </w:rPr>
+        <w:t xml:space="preserve"> </w:t>
+      </w:r>
+      <w:r>
+        <w:rPr>
+          <w:sz w:val="20"/>
+          <w:szCs w:val="20"/>
+        </w:rPr>
+        <w:t>Low Legibility Text</w:t>
+      </w:r>
+    </w:p>
+    <w:p>
+      <w:pPr>
+        <w:tabs>
+          <w:tab w:val="center" w:pos="4336"/>
+          <w:tab w:val="left" w:pos="6120"/>
+        </w:tabs>
+        <w:ind w:firstLine="360"/>
+        <w:rPr>
+          <w:sz w:val="20"/>
+          <w:szCs w:val="20"/>
+        </w:rPr>
+      </w:pPr>
+      <w:r>
+        <w:rPr>
+          <w:sz w:val="20"/>
+          <w:szCs w:val="20"/>
+        </w:rPr>
+        <w:tab/>
+      </w:r>
+    </w:p>
+    <w:p>
+      <w:pPr>
+        <w:tabs>
+          <w:tab w:val="center" w:pos="4336"/>
+          <w:tab w:val="left" w:pos="6120"/>
+        </w:tabs>
+        <w:rPr>
+          <w:sz w:val="20"/>
+          <w:szCs w:val="20"/>
+        </w:rPr>
+      </w:pPr>
+      <w:r>
+        <w:rPr>
+          <w:sz w:val="20"/>
+          <w:szCs w:val="20"/>
+        </w:rPr>
+        <w:t xml:space="preserve">Figure </w:t>
+      </w:r>
+      <w:r>
+        <w:rPr>
+          <w:sz w:val="20"/>
+          <w:szCs w:val="20"/>
+        </w:rPr>
+        <w:t>6</w:t>
+      </w:r>
+      <w:r>
+        <w:rPr>
+          <w:sz w:val="20"/>
+          <w:szCs w:val="20"/>
+        </w:rPr>
+        <w:t xml:space="preserve"> illustrates model predictions on low legibility inputs characterized by heavy background noise, diagonal line interference, and irregular stroke patterns. For the text "Transformer 5", both models produce correct predictions, indicating sufficient robustness to moderate noise when character shapes remain distinguishable. However, for "Hard to read", the baseline predicts "Hadto read", omitting a character and merging tokens, while the HFF model outputs "Hardto ready" — substituting the final word. Neither model achieves a fully correct prediction in this case, which is expected given the extreme visual degradation. These results suggest that hierarchical feature fusion partially mitigates noise sensitivity but does not fully resolve recognition errors under severe occlusion and interference.</w:t>
+      </w:r>
+    </w:p>
+    <w:p>
+      <w:pPr>
+        <w:tabs>
+          <w:tab w:val="center" w:pos="4336"/>
+          <w:tab w:val="left" w:pos="6120"/>
+        </w:tabs>
+        <w:rPr>
+          <w:sz w:val="20"/>
+          <w:szCs w:val="20"/>
+        </w:rPr>
+      </w:pPr>
+    </w:p>
+    <w:p>
+      <w:pPr>
+        <w:tabs>
+          <w:tab w:val="center" w:pos="4336"/>
+          <w:tab w:val="left" w:pos="6120"/>
+        </w:tabs>
+        <w:rPr>
+          <w:sz w:val="20"/>
+          <w:szCs w:val="20"/>
+        </w:rPr>
+      </w:pPr>
+      <w:r>
+        <w:rPr>
+          <w:noProof/>
+          <w:sz w:val="20"/>
+          <w:szCs w:val="20"/>
+        </w:rPr>
+        <w:drawing>
+          <wp:inline distT="0" distB="0" distL="0" distR="0" wp14:anchorId="0109A29D" wp14:editId="0687549D">
+            <wp:extent cx="5271135" cy="389890"/>
+            <wp:effectExtent l="0" t="0" r="5715" b="0"/>
+            <wp:docPr id="1158843686" name="Picture 3"/>
+            <wp:cNvGraphicFramePr>
+              <a:graphicFrameLocks xmlns:a="http://schemas.openxmlformats.org/drawingml/2006/main" noChangeAspect="1"/>
+            </wp:cNvGraphicFramePr>
+            <a:graphic xmlns:a="http://schemas.openxmlformats.org/drawingml/2006/main">
+              <a:graphicData uri="http://schemas.openxmlformats.org/drawingml/2006/picture">
+                <pic:pic xmlns:pic="http://schemas.openxmlformats.org/drawingml/2006/picture">
+                  <pic:nvPicPr>
+                    <pic:cNvPr id="0" name="Picture 4"/>
+                    <pic:cNvPicPr>
+                      <a:picLocks noChangeAspect="1" noChangeArrowheads="1"/>
+                    </pic:cNvPicPr>
+                  </pic:nvPicPr>
+                  <pic:blipFill>
+                    <a:blip r:embed="rId17" cstate="print">
+                      <a:extLst>
+                        <a:ext uri="{28A0092B-C50C-407E-A947-70E740481C1C}">
+                          <a14:useLocalDpi xmlns:a14="http://schemas.microsoft.com/office/drawing/2010/main" val="0"/>
+                        </a:ext>
+                      </a:extLst>
+                    </a:blip>
+                    <a:srcRect/>
+                    <a:stretch>
+                      <a:fillRect/>
+                    </a:stretch>
+                  </pic:blipFill>
+                  <pic:spPr bwMode="auto">
+                    <a:xfrm>
+                      <a:off x="0" y="0"/>
+                      <a:ext cx="5271135" cy="389890"/>
+                    </a:xfrm>
+                    <a:prstGeom prst="rect">
+                      <a:avLst/>
+                    </a:prstGeom>
+                    <a:noFill/>
+                    <a:ln>
+                      <a:noFill/>
+                    </a:ln>
+                  </pic:spPr>
+                </pic:pic>
+              </a:graphicData>
+            </a:graphic>
+          </wp:inline>
+        </w:drawing>
+      </w:r>
+    </w:p>
+    <w:p>
+      <w:pPr>
+        <w:tabs>
+          <w:tab w:val="center" w:pos="4336"/>
+          <w:tab w:val="left" w:pos="6120"/>
+        </w:tabs>
+        <w:ind w:firstLine="360"/>
+        <w:rPr>
+          <w:sz w:val="20"/>
+          <w:szCs w:val="20"/>
+        </w:rPr>
+      </w:pPr>
+      <w:r>
+        <w:rPr>
+          <w:b/>
+          <w:sz w:val="20"/>
+          <w:szCs w:val="20"/>
+        </w:rPr>
+        <w:tab/>
+        <w:t>Figure</w:t>
+      </w:r>
+      <w:r>
+        <w:rPr>
+          <w:b/>
+          <w:sz w:val="20"/>
+          <w:szCs w:val="20"/>
+        </w:rPr>
+        <w:t xml:space="preserve"> </w:t>
+      </w:r>
+      <w:r>
+        <w:rPr>
+          <w:b/>
+          <w:sz w:val="20"/>
+          <w:szCs w:val="20"/>
+        </w:rPr>
+        <w:t>7</w:t>
+      </w:r>
+      <w:r>
+        <w:rPr>
+          <w:sz w:val="20"/>
+          <w:szCs w:val="20"/>
+        </w:rPr>
+        <w:t>.</w:t>
+      </w:r>
+      <w:r>
+        <w:rPr>
+          <w:sz w:val="20"/>
+          <w:szCs w:val="20"/>
+        </w:rPr>
+        <w:t xml:space="preserve"> Hand written text</w:t>
+      </w:r>
+    </w:p>
+    <w:p>
+      <w:pPr>
+        <w:tabs>
+          <w:tab w:val="center" w:pos="4336"/>
+          <w:tab w:val="left" w:pos="6120"/>
+        </w:tabs>
+        <w:ind w:firstLine="360"/>
+        <w:rPr>
+          <w:sz w:val="20"/>
+          <w:szCs w:val="20"/>
+        </w:rPr>
+      </w:pPr>
+    </w:p>
+    <w:p>
+      <w:pPr>
+        <w:tabs>
+          <w:tab w:val="center" w:pos="4336"/>
+          <w:tab w:val="left" w:pos="6120"/>
+        </w:tabs>
+        <w:rPr>
+          <w:sz w:val="20"/>
+          <w:szCs w:val="20"/>
+        </w:rPr>
+      </w:pPr>
+      <w:r>
+        <w:rPr>
+          <w:sz w:val="20"/>
+          <w:szCs w:val="20"/>
+        </w:rPr>
+        <w:t xml:space="preserve">Figure </w:t>
+      </w:r>
+      <w:r>
+        <w:rPr>
+          <w:sz w:val="20"/>
+          <w:szCs w:val="20"/>
+        </w:rPr>
+        <w:t>7</w:t>
+      </w:r>
+      <w:r>
+        <w:rPr>
+          <w:sz w:val="20"/>
+          <w:szCs w:val="20"/>
+        </w:rPr>
+        <w:t xml:space="preserve"> presents predictions on handwritten-style inputs with irregular letterforms and mixed font styles. For "ABcde123", the baseline predicts "AccJe1223", producing multiple substitution errors on visually similar characters (B→c, d→J), whereas the HFF model correctly predicts "ABcde123", demonstrating improved discrimination of mixed-case alphanumeric sequences. For "I am writing", the baseline omits the word "am", outputting "I writin9" with an additional digit substitution, while the HFF model produces "I am writin9" — recovering the missing token but retaining the final character error. This indicates that shallow-level features captured by the hierarchical fusion contribute meaningfully to spatial completeness of predictions.</w:t>
       </w:r>
     </w:p>
     <w:p>
@@ -2840,6 +3976,7 @@
           <w:sz w:val="22"/>
           <w:szCs w:val="22"/>
         </w:rPr>
+        <w:lastRenderedPageBreak/>
         <w:t>Graves, A., Fernández, S., Gomez, F., Schmidhuber, J., "Connectionist Temporal Classification: Labelling Unsegmented Sequence Data with Recurrent Neural Networks," Proceedings of the 23rd International Conference on Machine Learning (ICML), 2006.</w:t>
       </w:r>
       <w:r>
@@ -2944,10 +4081,10 @@
       </w:r>
     </w:p>
     <w:sectPr>
-      <w:headerReference w:type="even" r:id="rId11"/>
-      <w:headerReference w:type="default" r:id="rId12"/>
-      <w:footerReference w:type="default" r:id="rId13"/>
-      <w:footerReference w:type="first" r:id="rId14"/>
+      <w:headerReference w:type="even" r:id="rId18"/>
+      <w:headerReference w:type="default" r:id="rId19"/>
+      <w:footerReference w:type="default" r:id="rId20"/>
+      <w:footerReference w:type="first" r:id="rId21"/>
       <w:pgSz w:w="11906" w:h="16838" w:code="9"/>
       <w:pgMar w:top="1440" w:right="1797" w:bottom="1440" w:left="1797" w:header="709" w:footer="709" w:gutter="0"/>
       <w:cols w:space="708"/>
@@ -3240,7 +4377,6 @@
         <w:szCs w:val="20"/>
       </w:rPr>
     </w:pPr>
-    <w:proofErr w:type="spellStart"/>
     <w:smartTag w:uri="urn:schemas-microsoft-com:office:smarttags" w:element="place">
       <w:smartTag w:uri="urn:schemas-microsoft-com:office:smarttags" w:element="City">
         <w:r>
@@ -3253,7 +4389,6 @@
           <w:t>Kopaonik</w:t>
         </w:r>
       </w:smartTag>
-      <w:proofErr w:type="spellEnd"/>
       <w:r>
         <w:rPr>
           <w:iCs/>
@@ -3294,9 +4429,9 @@
     </w:r>
     <w:smartTag w:uri="urn:schemas-microsoft-com:office:smarttags" w:element="date">
       <w:smartTagPr>
+        <w:attr w:name="Month" w:val="4"/>
+        <w:attr w:name="Day" w:val="10"/>
         <w:attr w:name="Year" w:val="2007"/>
-        <w:attr w:name="Day" w:val="10"/>
-        <w:attr w:name="Month" w:val="4"/>
       </w:smartTagPr>
       <w:r>
         <w:rPr>
@@ -3669,7 +4804,7 @@
       <w:lvlText w:val=""/>
       <w:lvlJc w:val="left"/>
       <w:pPr>
-        <w:ind w:left="720" w:hanging="360"/>
+        <w:ind w:left="360" w:hanging="360"/>
       </w:pPr>
       <w:rPr>
         <w:rFonts w:ascii="Symbol" w:hAnsi="Symbol" w:hint="default"/>
@@ -3681,7 +4816,7 @@
       <w:lvlText w:val="o"/>
       <w:lvlJc w:val="left"/>
       <w:pPr>
-        <w:ind w:left="1440" w:hanging="360"/>
+        <w:ind w:left="1080" w:hanging="360"/>
       </w:pPr>
       <w:rPr>
         <w:rFonts w:ascii="Courier New" w:hAnsi="Courier New" w:cs="Courier New" w:hint="default"/>
@@ -3693,7 +4828,7 @@
       <w:lvlText w:val=""/>
       <w:lvlJc w:val="left"/>
       <w:pPr>
-        <w:ind w:left="2160" w:hanging="360"/>
+        <w:ind w:left="1800" w:hanging="360"/>
       </w:pPr>
       <w:rPr>
         <w:rFonts w:ascii="Wingdings" w:hAnsi="Wingdings" w:hint="default"/>
@@ -3705,7 +4840,7 @@
       <w:lvlText w:val=""/>
       <w:lvlJc w:val="left"/>
       <w:pPr>
-        <w:ind w:left="2880" w:hanging="360"/>
+        <w:ind w:left="2520" w:hanging="360"/>
       </w:pPr>
       <w:rPr>
         <w:rFonts w:ascii="Symbol" w:hAnsi="Symbol" w:hint="default"/>
@@ -3717,7 +4852,7 @@
       <w:lvlText w:val="o"/>
       <w:lvlJc w:val="left"/>
       <w:pPr>
-        <w:ind w:left="3600" w:hanging="360"/>
+        <w:ind w:left="3240" w:hanging="360"/>
       </w:pPr>
       <w:rPr>
         <w:rFonts w:ascii="Courier New" w:hAnsi="Courier New" w:cs="Courier New" w:hint="default"/>
@@ -3729,7 +4864,7 @@
       <w:lvlText w:val=""/>
       <w:lvlJc w:val="left"/>
       <w:pPr>
-        <w:ind w:left="4320" w:hanging="360"/>
+        <w:ind w:left="3960" w:hanging="360"/>
       </w:pPr>
       <w:rPr>
         <w:rFonts w:ascii="Wingdings" w:hAnsi="Wingdings" w:hint="default"/>
@@ -3741,7 +4876,7 @@
       <w:lvlText w:val=""/>
       <w:lvlJc w:val="left"/>
       <w:pPr>
-        <w:ind w:left="5040" w:hanging="360"/>
+        <w:ind w:left="4680" w:hanging="360"/>
       </w:pPr>
       <w:rPr>
         <w:rFonts w:ascii="Symbol" w:hAnsi="Symbol" w:hint="default"/>
@@ -3753,7 +4888,7 @@
       <w:lvlText w:val="o"/>
       <w:lvlJc w:val="left"/>
       <w:pPr>
-        <w:ind w:left="5760" w:hanging="360"/>
+        <w:ind w:left="5400" w:hanging="360"/>
       </w:pPr>
       <w:rPr>
         <w:rFonts w:ascii="Courier New" w:hAnsi="Courier New" w:cs="Courier New" w:hint="default"/>
@@ -3765,7 +4900,7 @@
       <w:lvlText w:val=""/>
       <w:lvlJc w:val="left"/>
       <w:pPr>
-        <w:ind w:left="6480" w:hanging="360"/>
+        <w:ind w:left="6120" w:hanging="360"/>
       </w:pPr>
       <w:rPr>
         <w:rFonts w:ascii="Wingdings" w:hAnsi="Wingdings" w:hint="default"/>
@@ -3898,7 +5033,7 @@
       <w:lvlText w:val=""/>
       <w:lvlJc w:val="left"/>
       <w:pPr>
-        <w:ind w:left="720" w:hanging="360"/>
+        <w:ind w:left="360" w:hanging="360"/>
       </w:pPr>
       <w:rPr>
         <w:rFonts w:ascii="Symbol" w:hAnsi="Symbol" w:hint="default"/>
@@ -3910,7 +5045,7 @@
       <w:lvlText w:val="o"/>
       <w:lvlJc w:val="left"/>
       <w:pPr>
-        <w:ind w:left="1440" w:hanging="360"/>
+        <w:ind w:left="1080" w:hanging="360"/>
       </w:pPr>
       <w:rPr>
         <w:rFonts w:ascii="Courier New" w:hAnsi="Courier New" w:cs="Courier New" w:hint="default"/>
@@ -3922,7 +5057,7 @@
       <w:lvlText w:val=""/>
       <w:lvlJc w:val="left"/>
       <w:pPr>
-        <w:ind w:left="2160" w:hanging="360"/>
+        <w:ind w:left="1800" w:hanging="360"/>
       </w:pPr>
       <w:rPr>
         <w:rFonts w:ascii="Wingdings" w:hAnsi="Wingdings" w:hint="default"/>
@@ -3934,7 +5069,7 @@
       <w:lvlText w:val=""/>
       <w:lvlJc w:val="left"/>
       <w:pPr>
-        <w:ind w:left="2880" w:hanging="360"/>
+        <w:ind w:left="2520" w:hanging="360"/>
       </w:pPr>
       <w:rPr>
         <w:rFonts w:ascii="Symbol" w:hAnsi="Symbol" w:hint="default"/>
@@ -3946,7 +5081,7 @@
       <w:lvlText w:val="o"/>
       <w:lvlJc w:val="left"/>
       <w:pPr>
-        <w:ind w:left="3600" w:hanging="360"/>
+        <w:ind w:left="3240" w:hanging="360"/>
       </w:pPr>
       <w:rPr>
         <w:rFonts w:ascii="Courier New" w:hAnsi="Courier New" w:cs="Courier New" w:hint="default"/>
@@ -3958,7 +5093,7 @@
       <w:lvlText w:val=""/>
       <w:lvlJc w:val="left"/>
       <w:pPr>
-        <w:ind w:left="4320" w:hanging="360"/>
+        <w:ind w:left="3960" w:hanging="360"/>
       </w:pPr>
       <w:rPr>
         <w:rFonts w:ascii="Wingdings" w:hAnsi="Wingdings" w:hint="default"/>
@@ -3970,7 +5105,7 @@
       <w:lvlText w:val=""/>
       <w:lvlJc w:val="left"/>
       <w:pPr>
-        <w:ind w:left="5040" w:hanging="360"/>
+        <w:ind w:left="4680" w:hanging="360"/>
       </w:pPr>
       <w:rPr>
         <w:rFonts w:ascii="Symbol" w:hAnsi="Symbol" w:hint="default"/>
@@ -3982,7 +5117,7 @@
       <w:lvlText w:val="o"/>
       <w:lvlJc w:val="left"/>
       <w:pPr>
-        <w:ind w:left="5760" w:hanging="360"/>
+        <w:ind w:left="5400" w:hanging="360"/>
       </w:pPr>
       <w:rPr>
         <w:rFonts w:ascii="Courier New" w:hAnsi="Courier New" w:cs="Courier New" w:hint="default"/>
@@ -3994,7 +5129,7 @@
       <w:lvlText w:val=""/>
       <w:lvlJc w:val="left"/>
       <w:pPr>
-        <w:ind w:left="6480" w:hanging="360"/>
+        <w:ind w:left="6120" w:hanging="360"/>
       </w:pPr>
       <w:rPr>
         <w:rFonts w:ascii="Wingdings" w:hAnsi="Wingdings" w:hint="default"/>
@@ -4276,7 +5411,7 @@
       <w:lvlText w:val="%1."/>
       <w:lvlJc w:val="left"/>
       <w:pPr>
-        <w:ind w:left="720" w:hanging="360"/>
+        <w:ind w:left="360" w:hanging="360"/>
       </w:pPr>
     </w:lvl>
     <w:lvl w:ilvl="1" w:tplc="04090019" w:tentative="1">
@@ -4285,7 +5420,7 @@
       <w:lvlText w:val="%2."/>
       <w:lvlJc w:val="left"/>
       <w:pPr>
-        <w:ind w:left="1440" w:hanging="360"/>
+        <w:ind w:left="1080" w:hanging="360"/>
       </w:pPr>
     </w:lvl>
     <w:lvl w:ilvl="2" w:tplc="0409001B" w:tentative="1">
@@ -4294,7 +5429,7 @@
       <w:lvlText w:val="%3."/>
       <w:lvlJc w:val="right"/>
       <w:pPr>
-        <w:ind w:left="2160" w:hanging="180"/>
+        <w:ind w:left="1800" w:hanging="180"/>
       </w:pPr>
     </w:lvl>
     <w:lvl w:ilvl="3" w:tplc="0409000F" w:tentative="1">
@@ -4303,7 +5438,7 @@
       <w:lvlText w:val="%4."/>
       <w:lvlJc w:val="left"/>
       <w:pPr>
-        <w:ind w:left="2880" w:hanging="360"/>
+        <w:ind w:left="2520" w:hanging="360"/>
       </w:pPr>
     </w:lvl>
     <w:lvl w:ilvl="4" w:tplc="04090019" w:tentative="1">
@@ -4312,7 +5447,7 @@
       <w:lvlText w:val="%5."/>
       <w:lvlJc w:val="left"/>
       <w:pPr>
-        <w:ind w:left="3600" w:hanging="360"/>
+        <w:ind w:left="3240" w:hanging="360"/>
       </w:pPr>
     </w:lvl>
     <w:lvl w:ilvl="5" w:tplc="0409001B" w:tentative="1">
@@ -4321,7 +5456,7 @@
       <w:lvlText w:val="%6."/>
       <w:lvlJc w:val="right"/>
       <w:pPr>
-        <w:ind w:left="4320" w:hanging="180"/>
+        <w:ind w:left="3960" w:hanging="180"/>
       </w:pPr>
     </w:lvl>
     <w:lvl w:ilvl="6" w:tplc="0409000F" w:tentative="1">
@@ -4330,7 +5465,7 @@
       <w:lvlText w:val="%7."/>
       <w:lvlJc w:val="left"/>
       <w:pPr>
-        <w:ind w:left="5040" w:hanging="360"/>
+        <w:ind w:left="4680" w:hanging="360"/>
       </w:pPr>
     </w:lvl>
     <w:lvl w:ilvl="7" w:tplc="04090019" w:tentative="1">
@@ -4339,7 +5474,7 @@
       <w:lvlText w:val="%8."/>
       <w:lvlJc w:val="left"/>
       <w:pPr>
-        <w:ind w:left="5760" w:hanging="360"/>
+        <w:ind w:left="5400" w:hanging="360"/>
       </w:pPr>
     </w:lvl>
     <w:lvl w:ilvl="8" w:tplc="0409001B" w:tentative="1">
@@ -4348,7 +5483,7 @@
       <w:lvlText w:val="%9."/>
       <w:lvlJc w:val="right"/>
       <w:pPr>
-        <w:ind w:left="6480" w:hanging="180"/>
+        <w:ind w:left="6120" w:hanging="180"/>
       </w:pPr>
     </w:lvl>
   </w:abstractNum>
@@ -4819,7 +5954,6 @@
   <w:style w:type="character" w:default="1" w:styleId="DefaultParagraphFont">
     <w:name w:val="Default Paragraph Font"/>
     <w:uiPriority w:val="1"/>
-    <w:semiHidden/>
     <w:unhideWhenUsed/>
   </w:style>
   <w:style w:type="table" w:default="1" w:styleId="TableNormal">

</xml_diff>